<commit_message>
nmv 28 02 2026
</commit_message>
<xml_diff>
--- a/TS-Kramam/TS-1.5/TS 1.5 Malayalam Krama Paatam Corrections.docx
+++ b/TS-Kramam/TS-1.5/TS 1.5 Malayalam Krama Paatam Corrections.docx
@@ -762,6 +762,533 @@
       </w:tr>
       <w:tr>
         <w:trPr>
+          <w:trHeight w:val="2413"/>
+        </w:trPr>
+        <w:tc>
+          <w:tcPr>
+            <w:tcW w:w="3764" w:type="dxa"/>
+            <w:tcBorders>
+              <w:top w:val="single" w:sz="4" w:space="0" w:color="000000"/>
+              <w:left w:val="single" w:sz="4" w:space="0" w:color="000000"/>
+              <w:bottom w:val="single" w:sz="4" w:space="0" w:color="000000"/>
+              <w:right w:val="single" w:sz="4" w:space="0" w:color="000000"/>
+            </w:tcBorders>
+          </w:tcPr>
+          <w:p>
+            <w:pPr>
+              <w:widowControl w:val="0"/>
+              <w:tabs>
+                <w:tab w:val="left" w:pos="993"/>
+              </w:tabs>
+              <w:autoSpaceDE w:val="0"/>
+              <w:autoSpaceDN w:val="0"/>
+              <w:adjustRightInd w:val="0"/>
+              <w:spacing w:before="0" w:line="240" w:lineRule="auto"/>
+              <w:rPr>
+                <w:rFonts w:eastAsia="Times New Roman" w:cs="Arial"/>
+                <w:b/>
+                <w:sz w:val="32"/>
+                <w:szCs w:val="32"/>
+                <w:lang w:val="en-IN" w:eastAsia="en-IN" w:bidi="ml-IN"/>
+              </w:rPr>
+            </w:pPr>
+            <w:r>
+              <w:rPr>
+                <w:rFonts w:eastAsia="Times New Roman" w:cs="Arial"/>
+                <w:b/>
+                <w:sz w:val="32"/>
+                <w:szCs w:val="32"/>
+                <w:lang w:val="en-IN" w:eastAsia="en-IN" w:bidi="ml-IN"/>
+              </w:rPr>
+              <w:t>T.S.1.5.</w:t>
+            </w:r>
+            <w:r>
+              <w:rPr>
+                <w:rFonts w:eastAsia="Times New Roman" w:cs="Arial"/>
+                <w:b/>
+                <w:sz w:val="32"/>
+                <w:szCs w:val="32"/>
+                <w:lang w:val="en-IN" w:eastAsia="en-IN" w:bidi="ml-IN"/>
+              </w:rPr>
+              <w:t>11.</w:t>
+            </w:r>
+            <w:r>
+              <w:rPr>
+                <w:rFonts w:eastAsia="Times New Roman" w:cs="Arial"/>
+                <w:b/>
+                <w:sz w:val="32"/>
+                <w:szCs w:val="32"/>
+                <w:lang w:val="en-IN" w:eastAsia="en-IN" w:bidi="ml-IN"/>
+              </w:rPr>
+              <w:t>2</w:t>
+            </w:r>
+            <w:r>
+              <w:rPr>
+                <w:rFonts w:eastAsia="Times New Roman" w:cs="Arial"/>
+                <w:b/>
+                <w:sz w:val="32"/>
+                <w:szCs w:val="32"/>
+                <w:lang w:val="en-IN" w:eastAsia="en-IN" w:bidi="ml-IN"/>
+              </w:rPr>
+              <w:t xml:space="preserve"> - Kramam</w:t>
+            </w:r>
+          </w:p>
+          <w:p>
+            <w:pPr>
+              <w:widowControl w:val="0"/>
+              <w:tabs>
+                <w:tab w:val="left" w:pos="993"/>
+              </w:tabs>
+              <w:autoSpaceDE w:val="0"/>
+              <w:autoSpaceDN w:val="0"/>
+              <w:adjustRightInd w:val="0"/>
+              <w:spacing w:before="0" w:line="240" w:lineRule="auto"/>
+              <w:rPr>
+                <w:rFonts w:eastAsia="Times New Roman" w:cs="Arial"/>
+                <w:b/>
+                <w:szCs w:val="24"/>
+                <w:lang w:val="it-IT" w:eastAsia="en-IN" w:bidi="ml-IN"/>
+              </w:rPr>
+            </w:pPr>
+            <w:r>
+              <w:rPr>
+                <w:rFonts w:eastAsia="Times New Roman" w:cs="Arial"/>
+                <w:b/>
+                <w:szCs w:val="24"/>
+                <w:lang w:val="it-IT" w:eastAsia="en-IN" w:bidi="ml-IN"/>
+              </w:rPr>
+              <w:t xml:space="preserve">Krama Vaakyam No. </w:t>
+            </w:r>
+            <w:r>
+              <w:rPr>
+                <w:rFonts w:eastAsia="Times New Roman" w:cs="Arial"/>
+                <w:b/>
+                <w:szCs w:val="24"/>
+                <w:lang w:val="it-IT" w:eastAsia="en-IN" w:bidi="ml-IN"/>
+              </w:rPr>
+              <w:t>46, 47</w:t>
+            </w:r>
+          </w:p>
+          <w:p>
+            <w:pPr>
+              <w:widowControl w:val="0"/>
+              <w:tabs>
+                <w:tab w:val="left" w:pos="993"/>
+              </w:tabs>
+              <w:autoSpaceDE w:val="0"/>
+              <w:autoSpaceDN w:val="0"/>
+              <w:adjustRightInd w:val="0"/>
+              <w:spacing w:before="0" w:line="240" w:lineRule="auto"/>
+              <w:rPr>
+                <w:rFonts w:eastAsia="Times New Roman" w:cs="Arial"/>
+                <w:b/>
+                <w:sz w:val="32"/>
+                <w:szCs w:val="32"/>
+                <w:lang w:val="it-IT" w:eastAsia="en-IN" w:bidi="ml-IN"/>
+              </w:rPr>
+            </w:pPr>
+            <w:r>
+              <w:rPr>
+                <w:rFonts w:eastAsia="Times New Roman" w:cs="Arial"/>
+                <w:b/>
+                <w:sz w:val="32"/>
+                <w:szCs w:val="32"/>
+                <w:lang w:val="it-IT" w:eastAsia="en-IN" w:bidi="ml-IN"/>
+              </w:rPr>
+              <w:t xml:space="preserve">Panchaati No. </w:t>
+            </w:r>
+            <w:r>
+              <w:rPr>
+                <w:rFonts w:eastAsia="Times New Roman" w:cs="Arial"/>
+                <w:b/>
+                <w:sz w:val="32"/>
+                <w:szCs w:val="32"/>
+                <w:lang w:val="it-IT" w:eastAsia="en-IN" w:bidi="ml-IN"/>
+              </w:rPr>
+              <w:t>48</w:t>
+            </w:r>
+          </w:p>
+        </w:tc>
+        <w:tc>
+          <w:tcPr>
+            <w:tcW w:w="5102" w:type="dxa"/>
+            <w:tcBorders>
+              <w:top w:val="single" w:sz="4" w:space="0" w:color="000000"/>
+              <w:left w:val="single" w:sz="4" w:space="0" w:color="000000"/>
+              <w:bottom w:val="single" w:sz="4" w:space="0" w:color="000000"/>
+              <w:right w:val="single" w:sz="4" w:space="0" w:color="000000"/>
+            </w:tcBorders>
+          </w:tcPr>
+          <w:p>
+            <w:pPr>
+              <w:widowControl w:val="0"/>
+              <w:autoSpaceDE w:val="0"/>
+              <w:autoSpaceDN w:val="0"/>
+              <w:adjustRightInd w:val="0"/>
+              <w:spacing w:line="252" w:lineRule="auto"/>
+              <w:rPr>
+                <w:rFonts w:ascii="BRH Malayalam Extra" w:hAnsi="BRH Malayalam Extra" w:cs="BRH Malayalam Extra"/>
+                <w:sz w:val="40"/>
+                <w:szCs w:val="40"/>
+              </w:rPr>
+            </w:pPr>
+            <w:r>
+              <w:rPr>
+                <w:rFonts w:ascii="BRH Malayalam Extra" w:hAnsi="BRH Malayalam Extra" w:cs="BRH Malayalam Extra"/>
+                <w:sz w:val="40"/>
+                <w:szCs w:val="40"/>
+              </w:rPr>
+              <w:t>i</w:t>
+            </w:r>
+            <w:r>
+              <w:rPr>
+                <w:rFonts w:ascii="BRH Malayalam Extra" w:hAnsi="BRH Malayalam Extra" w:cs="BRH Malayalam Extra"/>
+                <w:b/>
+                <w:sz w:val="32"/>
+                <w:szCs w:val="40"/>
+              </w:rPr>
+              <w:t>–</w:t>
+            </w:r>
+            <w:r>
+              <w:rPr>
+                <w:rFonts w:ascii="BRH Malayalam Extra" w:hAnsi="BRH Malayalam Extra" w:cs="BRH Malayalam Extra"/>
+                <w:sz w:val="40"/>
+                <w:szCs w:val="40"/>
+              </w:rPr>
+              <w:t>Np—a§s¡ cx</w:t>
+            </w:r>
+            <w:r>
+              <w:rPr>
+                <w:rFonts w:ascii="BRH Malayalam Extra" w:hAnsi="BRH Malayalam Extra" w:cs="BRH Malayalam Extra"/>
+                <w:sz w:val="40"/>
+                <w:szCs w:val="40"/>
+                <w:highlight w:val="yellow"/>
+              </w:rPr>
+              <w:t>k</w:t>
+            </w:r>
+            <w:r>
+              <w:rPr>
+                <w:rFonts w:ascii="BRH Malayalam Extra" w:hAnsi="BRH Malayalam Extra" w:cs="BRH Malayalam Extra"/>
+                <w:b/>
+                <w:sz w:val="32"/>
+                <w:szCs w:val="40"/>
+              </w:rPr>
+              <w:t>–</w:t>
+            </w:r>
+            <w:r>
+              <w:rPr>
+                <w:rFonts w:ascii="BRH Malayalam Extra" w:hAnsi="BRH Malayalam Extra" w:cs="BRH Malayalam Extra"/>
+                <w:sz w:val="40"/>
+                <w:szCs w:val="40"/>
+              </w:rPr>
+              <w:t xml:space="preserve">j | </w:t>
+            </w:r>
+          </w:p>
+          <w:p>
+            <w:pPr>
+              <w:widowControl w:val="0"/>
+              <w:autoSpaceDE w:val="0"/>
+              <w:autoSpaceDN w:val="0"/>
+              <w:adjustRightInd w:val="0"/>
+              <w:spacing w:line="252" w:lineRule="auto"/>
+              <w:rPr>
+                <w:rFonts w:ascii="BRH Malayalam Extra" w:hAnsi="BRH Malayalam Extra" w:cs="BRH Malayalam Extra"/>
+                <w:sz w:val="40"/>
+                <w:szCs w:val="40"/>
+              </w:rPr>
+            </w:pPr>
+            <w:r>
+              <w:rPr>
+                <w:rFonts w:ascii="BRH Malayalam Extra" w:hAnsi="BRH Malayalam Extra" w:cs="BRH Malayalam Extra"/>
+                <w:sz w:val="40"/>
+                <w:szCs w:val="40"/>
+              </w:rPr>
+              <w:t>i</w:t>
+            </w:r>
+            <w:r>
+              <w:rPr>
+                <w:rFonts w:ascii="BRH Malayalam Extra" w:hAnsi="BRH Malayalam Extra" w:cs="BRH Malayalam Extra"/>
+                <w:b/>
+                <w:sz w:val="32"/>
+                <w:szCs w:val="40"/>
+              </w:rPr>
+              <w:t>–</w:t>
+            </w:r>
+            <w:r>
+              <w:rPr>
+                <w:rFonts w:ascii="BRH Malayalam Extra" w:hAnsi="BRH Malayalam Extra" w:cs="BRH Malayalam Extra"/>
+                <w:sz w:val="40"/>
+                <w:szCs w:val="40"/>
+              </w:rPr>
+              <w:t>Np</w:t>
+            </w:r>
+            <w:r>
+              <w:rPr>
+                <w:rFonts w:ascii="BRH Malayalam Extra" w:hAnsi="BRH Malayalam Extra" w:cs="BRH Malayalam Extra"/>
+                <w:b/>
+                <w:sz w:val="32"/>
+                <w:szCs w:val="40"/>
+              </w:rPr>
+              <w:t>–</w:t>
+            </w:r>
+            <w:r>
+              <w:rPr>
+                <w:rFonts w:ascii="BRH Malayalam Extra" w:hAnsi="BRH Malayalam Extra" w:cs="BRH Malayalam Extra"/>
+                <w:sz w:val="40"/>
+                <w:szCs w:val="40"/>
+              </w:rPr>
+              <w:t xml:space="preserve">a§sûyZy— </w:t>
+            </w:r>
+          </w:p>
+          <w:p>
+            <w:pPr>
+              <w:widowControl w:val="0"/>
+              <w:autoSpaceDE w:val="0"/>
+              <w:autoSpaceDN w:val="0"/>
+              <w:adjustRightInd w:val="0"/>
+              <w:spacing w:line="252" w:lineRule="auto"/>
+              <w:ind w:right="-165"/>
+              <w:rPr>
+                <w:rFonts w:ascii="BRH Malayalam Extra" w:hAnsi="BRH Malayalam Extra" w:cs="BRH Malayalam Extra"/>
+                <w:sz w:val="40"/>
+                <w:szCs w:val="40"/>
+              </w:rPr>
+            </w:pPr>
+            <w:r>
+              <w:rPr>
+                <w:rFonts w:ascii="BRH Malayalam Extra" w:hAnsi="BRH Malayalam Extra" w:cs="BRH Malayalam Extra"/>
+                <w:sz w:val="40"/>
+                <w:szCs w:val="40"/>
+              </w:rPr>
+              <w:t>i</w:t>
+            </w:r>
+            <w:r>
+              <w:rPr>
+                <w:rFonts w:ascii="BRH Malayalam Extra" w:hAnsi="BRH Malayalam Extra" w:cs="BRH Malayalam Extra"/>
+                <w:b/>
+                <w:sz w:val="32"/>
+                <w:szCs w:val="40"/>
+              </w:rPr>
+              <w:t>–</w:t>
+            </w:r>
+            <w:r>
+              <w:rPr>
+                <w:rFonts w:ascii="BRH Malayalam Extra" w:hAnsi="BRH Malayalam Extra" w:cs="BRH Malayalam Extra"/>
+                <w:sz w:val="40"/>
+                <w:szCs w:val="40"/>
+              </w:rPr>
+              <w:t xml:space="preserve">Np—Z§ - </w:t>
+            </w:r>
+            <w:r>
+              <w:rPr>
+                <w:rFonts w:ascii="BRH Malayalam Extra" w:hAnsi="BRH Malayalam Extra" w:cs="BRH Malayalam Extra"/>
+                <w:sz w:val="40"/>
+                <w:szCs w:val="40"/>
+                <w:highlight w:val="yellow"/>
+              </w:rPr>
+              <w:t>s¡</w:t>
+            </w:r>
+            <w:r>
+              <w:rPr>
+                <w:rFonts w:ascii="BRH Malayalam Extra" w:hAnsi="BRH Malayalam Extra" w:cs="BRH Malayalam Extra"/>
+                <w:sz w:val="40"/>
+                <w:szCs w:val="40"/>
+              </w:rPr>
+              <w:t xml:space="preserve"> |</w:t>
+            </w:r>
+          </w:p>
+        </w:tc>
+        <w:tc>
+          <w:tcPr>
+            <w:tcW w:w="5103" w:type="dxa"/>
+            <w:tcBorders>
+              <w:top w:val="single" w:sz="4" w:space="0" w:color="000000"/>
+              <w:left w:val="single" w:sz="4" w:space="0" w:color="000000"/>
+              <w:bottom w:val="single" w:sz="4" w:space="0" w:color="000000"/>
+              <w:right w:val="single" w:sz="4" w:space="0" w:color="000000"/>
+            </w:tcBorders>
+          </w:tcPr>
+          <w:p>
+            <w:pPr>
+              <w:widowControl w:val="0"/>
+              <w:autoSpaceDE w:val="0"/>
+              <w:autoSpaceDN w:val="0"/>
+              <w:adjustRightInd w:val="0"/>
+              <w:spacing w:line="252" w:lineRule="auto"/>
+              <w:rPr>
+                <w:rFonts w:ascii="BRH Malayalam Extra" w:hAnsi="BRH Malayalam Extra" w:cs="BRH Malayalam Extra"/>
+                <w:sz w:val="40"/>
+                <w:szCs w:val="40"/>
+              </w:rPr>
+            </w:pPr>
+            <w:r>
+              <w:rPr>
+                <w:rFonts w:ascii="BRH Malayalam Extra" w:hAnsi="BRH Malayalam Extra" w:cs="BRH Malayalam Extra"/>
+                <w:sz w:val="40"/>
+                <w:szCs w:val="40"/>
+              </w:rPr>
+              <w:t>i</w:t>
+            </w:r>
+            <w:r>
+              <w:rPr>
+                <w:rFonts w:ascii="BRH Malayalam Extra" w:hAnsi="BRH Malayalam Extra" w:cs="BRH Malayalam Extra"/>
+                <w:b/>
+                <w:sz w:val="32"/>
+                <w:szCs w:val="40"/>
+              </w:rPr>
+              <w:t>–</w:t>
+            </w:r>
+            <w:r>
+              <w:rPr>
+                <w:rFonts w:ascii="BRH Malayalam Extra" w:hAnsi="BRH Malayalam Extra" w:cs="BRH Malayalam Extra"/>
+                <w:sz w:val="40"/>
+                <w:szCs w:val="40"/>
+              </w:rPr>
+              <w:t>Np—a§s¡ cx</w:t>
+            </w:r>
+            <w:r>
+              <w:rPr>
+                <w:rFonts w:ascii="BRH Malayalam Extra" w:hAnsi="BRH Malayalam Extra" w:cs="BRH Malayalam Extra"/>
+                <w:sz w:val="40"/>
+                <w:szCs w:val="40"/>
+                <w:highlight w:val="green"/>
+              </w:rPr>
+              <w:t>k</w:t>
+            </w:r>
+            <w:r>
+              <w:rPr>
+                <w:rFonts w:ascii="BRH Malayalam Extra" w:hAnsi="BRH Malayalam Extra" w:cs="BRH Malayalam Extra"/>
+                <w:sz w:val="40"/>
+                <w:szCs w:val="40"/>
+              </w:rPr>
+              <w:t xml:space="preserve">j | </w:t>
+            </w:r>
+          </w:p>
+          <w:p>
+            <w:pPr>
+              <w:widowControl w:val="0"/>
+              <w:autoSpaceDE w:val="0"/>
+              <w:autoSpaceDN w:val="0"/>
+              <w:adjustRightInd w:val="0"/>
+              <w:spacing w:line="252" w:lineRule="auto"/>
+              <w:rPr>
+                <w:rFonts w:ascii="BRH Malayalam Extra" w:hAnsi="BRH Malayalam Extra" w:cs="BRH Malayalam Extra"/>
+                <w:sz w:val="40"/>
+                <w:szCs w:val="40"/>
+              </w:rPr>
+            </w:pPr>
+            <w:r>
+              <w:rPr>
+                <w:rFonts w:ascii="BRH Malayalam Extra" w:hAnsi="BRH Malayalam Extra" w:cs="BRH Malayalam Extra"/>
+                <w:sz w:val="40"/>
+                <w:szCs w:val="40"/>
+              </w:rPr>
+              <w:t>i</w:t>
+            </w:r>
+            <w:r>
+              <w:rPr>
+                <w:rFonts w:ascii="BRH Malayalam Extra" w:hAnsi="BRH Malayalam Extra" w:cs="BRH Malayalam Extra"/>
+                <w:b/>
+                <w:sz w:val="32"/>
+                <w:szCs w:val="40"/>
+              </w:rPr>
+              <w:t>–</w:t>
+            </w:r>
+            <w:r>
+              <w:rPr>
+                <w:rFonts w:ascii="BRH Malayalam Extra" w:hAnsi="BRH Malayalam Extra" w:cs="BRH Malayalam Extra"/>
+                <w:sz w:val="40"/>
+                <w:szCs w:val="40"/>
+              </w:rPr>
+              <w:t>Np</w:t>
+            </w:r>
+            <w:r>
+              <w:rPr>
+                <w:rFonts w:ascii="BRH Malayalam Extra" w:hAnsi="BRH Malayalam Extra" w:cs="BRH Malayalam Extra"/>
+                <w:b/>
+                <w:sz w:val="32"/>
+                <w:szCs w:val="40"/>
+              </w:rPr>
+              <w:t>–</w:t>
+            </w:r>
+            <w:r>
+              <w:rPr>
+                <w:rFonts w:ascii="BRH Malayalam Extra" w:hAnsi="BRH Malayalam Extra" w:cs="BRH Malayalam Extra"/>
+                <w:sz w:val="40"/>
+                <w:szCs w:val="40"/>
+              </w:rPr>
+              <w:t xml:space="preserve">a§sûyZy— </w:t>
+            </w:r>
+          </w:p>
+          <w:p>
+            <w:pPr>
+              <w:autoSpaceDE w:val="0"/>
+              <w:autoSpaceDN w:val="0"/>
+              <w:adjustRightInd w:val="0"/>
+              <w:spacing w:before="0" w:line="240" w:lineRule="auto"/>
+              <w:rPr>
+                <w:rFonts w:ascii="BRH Malayalam Extra" w:hAnsi="BRH Malayalam Extra" w:cs="BRH Malayalam Extra"/>
+                <w:sz w:val="40"/>
+                <w:szCs w:val="40"/>
+              </w:rPr>
+            </w:pPr>
+            <w:r>
+              <w:rPr>
+                <w:rFonts w:ascii="BRH Malayalam Extra" w:hAnsi="BRH Malayalam Extra" w:cs="BRH Malayalam Extra"/>
+                <w:sz w:val="40"/>
+                <w:szCs w:val="40"/>
+              </w:rPr>
+              <w:t>i</w:t>
+            </w:r>
+            <w:r>
+              <w:rPr>
+                <w:rFonts w:ascii="BRH Malayalam Extra" w:hAnsi="BRH Malayalam Extra" w:cs="BRH Malayalam Extra"/>
+                <w:b/>
+                <w:sz w:val="32"/>
+                <w:szCs w:val="40"/>
+              </w:rPr>
+              <w:t>–</w:t>
+            </w:r>
+            <w:r>
+              <w:rPr>
+                <w:rFonts w:ascii="BRH Malayalam Extra" w:hAnsi="BRH Malayalam Extra" w:cs="BRH Malayalam Extra"/>
+                <w:sz w:val="40"/>
+                <w:szCs w:val="40"/>
+              </w:rPr>
+              <w:t xml:space="preserve">Np—Z§ - </w:t>
+            </w:r>
+            <w:r>
+              <w:rPr>
+                <w:rFonts w:ascii="BRH Malayalam Extra" w:hAnsi="BRH Malayalam Extra" w:cs="BRH Malayalam Extra"/>
+                <w:sz w:val="40"/>
+                <w:szCs w:val="40"/>
+                <w:highlight w:val="green"/>
+              </w:rPr>
+              <w:t>s¡</w:t>
+            </w:r>
+            <w:r>
+              <w:rPr>
+                <w:rFonts w:ascii="BRH Malayalam Extra" w:hAnsi="BRH Malayalam Extra" w:cs="BRH Malayalam Extra"/>
+                <w:b/>
+                <w:sz w:val="32"/>
+                <w:szCs w:val="40"/>
+                <w:highlight w:val="green"/>
+              </w:rPr>
+              <w:t>–</w:t>
+            </w:r>
+            <w:r>
+              <w:rPr>
+                <w:rFonts w:ascii="BRH Malayalam Extra" w:hAnsi="BRH Malayalam Extra" w:cs="BRH Malayalam Extra"/>
+                <w:sz w:val="40"/>
+                <w:szCs w:val="40"/>
+              </w:rPr>
+              <w:t xml:space="preserve"> |</w:t>
+            </w:r>
+          </w:p>
+        </w:tc>
+      </w:tr>
+      <w:tr>
+        <w:trPr>
           <w:trHeight w:val="1105"/>
         </w:trPr>
         <w:tc>
@@ -1097,6 +1624,31 @@
           <w:u w:val="single"/>
         </w:rPr>
       </w:pPr>
+    </w:p>
+    <w:p>
+      <w:pPr>
+        <w:jc w:val="center"/>
+        <w:rPr>
+          <w:b/>
+          <w:bCs/>
+          <w:sz w:val="32"/>
+          <w:szCs w:val="32"/>
+          <w:u w:val="single"/>
+          <w:lang w:val="it-IT"/>
+        </w:rPr>
+      </w:pPr>
+    </w:p>
+    <w:p>
+      <w:pPr>
+        <w:jc w:val="center"/>
+        <w:rPr>
+          <w:b/>
+          <w:bCs/>
+          <w:sz w:val="32"/>
+          <w:szCs w:val="32"/>
+          <w:u w:val="single"/>
+        </w:rPr>
+      </w:pPr>
       <w:r>
         <w:rPr>
           <w:b/>
@@ -1105,6 +1657,7 @@
           <w:szCs w:val="32"/>
           <w:u w:val="single"/>
         </w:rPr>
+        <w:lastRenderedPageBreak/>
         <w:t xml:space="preserve">TS </w:t>
       </w:r>
       <w:r>
@@ -1670,7 +2223,6 @@
                 <w:szCs w:val="32"/>
                 <w:lang w:val="en-IN" w:eastAsia="en-IN" w:bidi="ml-IN"/>
               </w:rPr>
-              <w:lastRenderedPageBreak/>
               <w:t>T.S.1.5.</w:t>
             </w:r>
             <w:r>
@@ -3326,6 +3878,7 @@
                 <w:szCs w:val="32"/>
                 <w:lang w:val="en-IN" w:eastAsia="en-IN" w:bidi="ml-IN"/>
               </w:rPr>
+              <w:lastRenderedPageBreak/>
               <w:t>T.S.1.5.</w:t>
             </w:r>
             <w:r>
@@ -3647,42 +4200,6 @@
           <w:u w:val="single"/>
         </w:rPr>
       </w:pPr>
-    </w:p>
-    <w:p>
-      <w:pPr>
-        <w:jc w:val="center"/>
-        <w:rPr>
-          <w:b/>
-          <w:bCs/>
-          <w:sz w:val="32"/>
-          <w:szCs w:val="32"/>
-          <w:u w:val="single"/>
-        </w:rPr>
-      </w:pPr>
-    </w:p>
-    <w:p>
-      <w:pPr>
-        <w:jc w:val="center"/>
-        <w:rPr>
-          <w:b/>
-          <w:bCs/>
-          <w:sz w:val="32"/>
-          <w:szCs w:val="32"/>
-          <w:u w:val="single"/>
-        </w:rPr>
-      </w:pPr>
-    </w:p>
-    <w:p>
-      <w:pPr>
-        <w:jc w:val="center"/>
-        <w:rPr>
-          <w:b/>
-          <w:bCs/>
-          <w:sz w:val="32"/>
-          <w:szCs w:val="32"/>
-          <w:u w:val="single"/>
-        </w:rPr>
-      </w:pPr>
       <w:r>
         <w:rPr>
           <w:b/>
@@ -3691,7 +4208,6 @@
           <w:szCs w:val="32"/>
           <w:u w:val="single"/>
         </w:rPr>
-        <w:lastRenderedPageBreak/>
         <w:t xml:space="preserve">TS </w:t>
       </w:r>
       <w:r>
@@ -5596,6 +6112,7 @@
                 <w:szCs w:val="32"/>
                 <w:lang w:val="en-IN" w:eastAsia="en-IN" w:bidi="ml-IN"/>
               </w:rPr>
+              <w:lastRenderedPageBreak/>
               <w:t>T.S.1.5.</w:t>
             </w:r>
             <w:r>
@@ -6029,7 +6546,6 @@
           <w:szCs w:val="32"/>
           <w:u w:val="single"/>
         </w:rPr>
-        <w:lastRenderedPageBreak/>
         <w:t xml:space="preserve">TS </w:t>
       </w:r>
       <w:r>
@@ -7367,6 +7883,7 @@
                 <w:szCs w:val="32"/>
                 <w:lang w:val="en-IN" w:eastAsia="en-IN" w:bidi="ml-IN"/>
               </w:rPr>
+              <w:lastRenderedPageBreak/>
               <w:t>T.S.1.5.7.6 - Kramam</w:t>
             </w:r>
           </w:p>
@@ -8135,7 +8652,6 @@
                 <w:szCs w:val="32"/>
                 <w:lang w:val="en-IN" w:eastAsia="en-IN" w:bidi="ml-IN"/>
               </w:rPr>
-              <w:lastRenderedPageBreak/>
               <w:t>T.S.1.5.9.4 - Kramam</w:t>
             </w:r>
           </w:p>
@@ -9445,16 +9961,7 @@
           <w:bCs/>
           <w:sz w:val="32"/>
         </w:rPr>
-        <w:t xml:space="preserve">replaced </w:t>
-      </w:r>
-      <w:proofErr w:type="gramStart"/>
-      <w:r>
-        <w:rPr>
-          <w:b/>
-          <w:bCs/>
-          <w:sz w:val="32"/>
-        </w:rPr>
-        <w:t>with</w:t>
+        <w:t>replaced with</w:t>
       </w:r>
       <w:r>
         <w:rPr>
@@ -9474,29 +9981,7 @@
           <w:szCs w:val="40"/>
           <w:lang w:val="en-IN" w:eastAsia="en-IN"/>
         </w:rPr>
-        <w:t>"</w:t>
-      </w:r>
-      <w:proofErr w:type="gramEnd"/>
-      <w:r>
-        <w:rPr>
-          <w:rFonts w:ascii="BRH Malayalam" w:hAnsi="BRH Malayalam" w:cs="BRH Malayalam"/>
-          <w:color w:val="000000"/>
-          <w:sz w:val="40"/>
-          <w:szCs w:val="40"/>
-          <w:lang w:val="en-IN" w:eastAsia="en-IN"/>
-        </w:rPr>
-        <w:t>q§T</w:t>
-      </w:r>
-      <w:proofErr w:type="gramStart"/>
-      <w:r>
-        <w:rPr>
-          <w:rFonts w:ascii="BRH Malayalam" w:hAnsi="BRH Malayalam" w:cs="BRH Malayalam"/>
-          <w:color w:val="000000"/>
-          <w:sz w:val="40"/>
-          <w:szCs w:val="40"/>
-          <w:lang w:val="en-IN" w:eastAsia="en-IN"/>
-        </w:rPr>
-        <w:t xml:space="preserve">"  </w:t>
+        <w:t xml:space="preserve">"q§T"  </w:t>
       </w:r>
       <w:r>
         <w:rPr>
@@ -9504,16 +9989,7 @@
           <w:bCs/>
           <w:sz w:val="32"/>
         </w:rPr>
-        <w:t>wherever</w:t>
-      </w:r>
-      <w:proofErr w:type="gramEnd"/>
-      <w:r>
-        <w:rPr>
-          <w:b/>
-          <w:bCs/>
-          <w:sz w:val="32"/>
-        </w:rPr>
-        <w:t xml:space="preserve"> applicable</w:t>
+        <w:t>wherever applicable</w:t>
       </w:r>
     </w:p>
     <w:p>
@@ -9537,66 +10013,6 @@
         </w:rPr>
         <w:t>==============================</w:t>
       </w:r>
-    </w:p>
-    <w:p>
-      <w:pPr>
-        <w:jc w:val="center"/>
-        <w:rPr>
-          <w:b/>
-          <w:bCs/>
-          <w:sz w:val="32"/>
-          <w:szCs w:val="32"/>
-          <w:u w:val="single"/>
-        </w:rPr>
-      </w:pPr>
-    </w:p>
-    <w:p>
-      <w:pPr>
-        <w:jc w:val="center"/>
-        <w:rPr>
-          <w:b/>
-          <w:bCs/>
-          <w:sz w:val="32"/>
-          <w:szCs w:val="32"/>
-          <w:u w:val="single"/>
-        </w:rPr>
-      </w:pPr>
-    </w:p>
-    <w:p>
-      <w:pPr>
-        <w:jc w:val="center"/>
-        <w:rPr>
-          <w:b/>
-          <w:bCs/>
-          <w:sz w:val="32"/>
-          <w:szCs w:val="32"/>
-          <w:u w:val="single"/>
-        </w:rPr>
-      </w:pPr>
-    </w:p>
-    <w:p>
-      <w:pPr>
-        <w:jc w:val="center"/>
-        <w:rPr>
-          <w:b/>
-          <w:bCs/>
-          <w:sz w:val="32"/>
-          <w:szCs w:val="32"/>
-          <w:u w:val="single"/>
-        </w:rPr>
-      </w:pPr>
-    </w:p>
-    <w:p>
-      <w:pPr>
-        <w:jc w:val="center"/>
-        <w:rPr>
-          <w:b/>
-          <w:bCs/>
-          <w:sz w:val="32"/>
-          <w:szCs w:val="32"/>
-          <w:u w:val="single"/>
-        </w:rPr>
-      </w:pPr>
     </w:p>
     <w:p>
       <w:pPr>
@@ -14318,9 +14734,8 @@
                 <w:szCs w:val="28"/>
                 <w:lang w:bidi="ml-IN"/>
               </w:rPr>
-              <w:t>(</w:t>
-            </w:r>
-            <w:proofErr w:type="gramStart"/>
+              <w:t>(tri kramam</w:t>
+            </w:r>
             <w:r>
               <w:rPr>
                 <w:rFonts w:cs="Arial"/>
@@ -14329,9 +14744,8 @@
                 <w:szCs w:val="28"/>
                 <w:lang w:bidi="ml-IN"/>
               </w:rPr>
-              <w:t>tri</w:t>
-            </w:r>
-            <w:proofErr w:type="gramEnd"/>
+              <w:t xml:space="preserve"> indicat</w:t>
+            </w:r>
             <w:r>
               <w:rPr>
                 <w:rFonts w:cs="Arial"/>
@@ -14340,7 +14754,7 @@
                 <w:szCs w:val="28"/>
                 <w:lang w:bidi="ml-IN"/>
               </w:rPr>
-              <w:t xml:space="preserve"> kramam</w:t>
+              <w:t xml:space="preserve">ion not given/missed </w:t>
             </w:r>
             <w:r>
               <w:rPr>
@@ -14350,37 +14764,7 @@
                 <w:szCs w:val="28"/>
                 <w:lang w:bidi="ml-IN"/>
               </w:rPr>
-              <w:t xml:space="preserve"> indicat</w:t>
-            </w:r>
-            <w:r>
-              <w:rPr>
-                <w:rFonts w:cs="Arial"/>
-                <w:color w:val="000000"/>
-                <w:sz w:val="28"/>
-                <w:szCs w:val="28"/>
-                <w:lang w:bidi="ml-IN"/>
-              </w:rPr>
-              <w:t xml:space="preserve">ion not given/missed </w:t>
-            </w:r>
-            <w:r>
-              <w:rPr>
-                <w:rFonts w:cs="Arial"/>
-                <w:color w:val="000000"/>
-                <w:sz w:val="28"/>
-                <w:szCs w:val="28"/>
-                <w:lang w:bidi="ml-IN"/>
-              </w:rPr>
               <w:br/>
-            </w:r>
-            <w:proofErr w:type="gramStart"/>
-            <w:r>
-              <w:rPr>
-                <w:rFonts w:cs="Arial"/>
-                <w:color w:val="000000"/>
-                <w:sz w:val="28"/>
-                <w:szCs w:val="28"/>
-                <w:lang w:bidi="ml-IN"/>
-              </w:rPr>
               <w:t xml:space="preserve">add </w:t>
             </w:r>
             <w:r>
@@ -14401,18 +14785,7 @@
                 <w:szCs w:val="36"/>
                 <w:highlight w:val="green"/>
               </w:rPr>
-              <w:t>„</w:t>
-            </w:r>
-            <w:proofErr w:type="gramEnd"/>
-            <w:r>
-              <w:rPr>
-                <w:rFonts w:ascii="BRH Malayalam Extra" w:hAnsi="BRH Malayalam Extra" w:cs="BRH Malayalam Extra"/>
-                <w:color w:val="000000"/>
-                <w:sz w:val="36"/>
-                <w:szCs w:val="36"/>
-                <w:highlight w:val="green"/>
-              </w:rPr>
-              <w:t>„</w:t>
+              <w:t>„„</w:t>
             </w:r>
             <w:r>
               <w:rPr>

</xml_diff>

<commit_message>
NMV 06 04 2026
</commit_message>
<xml_diff>
--- a/TS-Kramam/TS-1.5/TS 1.5 Malayalam Krama Paatam Corrections.docx
+++ b/TS-Kramam/TS-1.5/TS 1.5 Malayalam Krama Paatam Corrections.docx
@@ -463,6 +463,429 @@
       </w:tr>
       <w:tr>
         <w:trPr>
+          <w:trHeight w:val="1547"/>
+        </w:trPr>
+        <w:tc>
+          <w:tcPr>
+            <w:tcW w:w="3764" w:type="dxa"/>
+            <w:tcBorders>
+              <w:top w:val="single" w:sz="4" w:space="0" w:color="000000"/>
+              <w:left w:val="single" w:sz="4" w:space="0" w:color="000000"/>
+              <w:bottom w:val="single" w:sz="4" w:space="0" w:color="000000"/>
+              <w:right w:val="single" w:sz="4" w:space="0" w:color="000000"/>
+            </w:tcBorders>
+          </w:tcPr>
+          <w:p>
+            <w:pPr>
+              <w:widowControl w:val="0"/>
+              <w:tabs>
+                <w:tab w:val="left" w:pos="993"/>
+              </w:tabs>
+              <w:autoSpaceDE w:val="0"/>
+              <w:autoSpaceDN w:val="0"/>
+              <w:adjustRightInd w:val="0"/>
+              <w:spacing w:before="0" w:line="240" w:lineRule="auto"/>
+              <w:rPr>
+                <w:rFonts w:eastAsia="Times New Roman" w:cs="Arial"/>
+                <w:b/>
+                <w:color w:val="EE0000"/>
+                <w:sz w:val="32"/>
+                <w:szCs w:val="32"/>
+                <w:lang w:val="en-IN" w:eastAsia="en-IN" w:bidi="ml-IN"/>
+              </w:rPr>
+            </w:pPr>
+            <w:r>
+              <w:rPr>
+                <w:rFonts w:eastAsia="Times New Roman" w:cs="Arial"/>
+                <w:b/>
+                <w:color w:val="EE0000"/>
+                <w:sz w:val="32"/>
+                <w:szCs w:val="32"/>
+                <w:lang w:val="en-IN" w:eastAsia="en-IN" w:bidi="ml-IN"/>
+              </w:rPr>
+              <w:t>T.S.1.5.5.</w:t>
+            </w:r>
+            <w:r>
+              <w:rPr>
+                <w:rFonts w:eastAsia="Times New Roman" w:cs="Arial"/>
+                <w:b/>
+                <w:color w:val="EE0000"/>
+                <w:sz w:val="32"/>
+                <w:szCs w:val="32"/>
+                <w:lang w:val="en-IN" w:eastAsia="en-IN" w:bidi="ml-IN"/>
+              </w:rPr>
+              <w:t>1</w:t>
+            </w:r>
+            <w:r>
+              <w:rPr>
+                <w:rFonts w:eastAsia="Times New Roman" w:cs="Arial"/>
+                <w:b/>
+                <w:color w:val="EE0000"/>
+                <w:sz w:val="32"/>
+                <w:szCs w:val="32"/>
+                <w:lang w:val="en-IN" w:eastAsia="en-IN" w:bidi="ml-IN"/>
+              </w:rPr>
+              <w:t xml:space="preserve"> - Kramam</w:t>
+            </w:r>
+          </w:p>
+          <w:p>
+            <w:pPr>
+              <w:widowControl w:val="0"/>
+              <w:autoSpaceDE w:val="0"/>
+              <w:autoSpaceDN w:val="0"/>
+              <w:adjustRightInd w:val="0"/>
+              <w:spacing w:before="0" w:line="240" w:lineRule="auto"/>
+              <w:rPr>
+                <w:rFonts w:cs="Arial"/>
+                <w:b/>
+                <w:bCs/>
+                <w:color w:val="EE0000"/>
+                <w:sz w:val="28"/>
+                <w:szCs w:val="36"/>
+                <w:lang w:val="it-IT" w:bidi="ml-IN"/>
+              </w:rPr>
+            </w:pPr>
+            <w:r>
+              <w:rPr>
+                <w:rFonts w:cs="Arial"/>
+                <w:b/>
+                <w:bCs/>
+                <w:color w:val="EE0000"/>
+                <w:sz w:val="28"/>
+                <w:szCs w:val="36"/>
+                <w:lang w:val="it-IT" w:bidi="ml-IN"/>
+              </w:rPr>
+              <w:t xml:space="preserve">Krama Vaakyam No. </w:t>
+            </w:r>
+            <w:r>
+              <w:rPr>
+                <w:rFonts w:cs="Arial"/>
+                <w:b/>
+                <w:bCs/>
+                <w:color w:val="EE0000"/>
+                <w:sz w:val="28"/>
+                <w:szCs w:val="36"/>
+                <w:lang w:val="it-IT" w:bidi="ml-IN"/>
+              </w:rPr>
+              <w:t>41</w:t>
+            </w:r>
+          </w:p>
+          <w:p>
+            <w:pPr>
+              <w:widowControl w:val="0"/>
+              <w:tabs>
+                <w:tab w:val="left" w:pos="993"/>
+              </w:tabs>
+              <w:autoSpaceDE w:val="0"/>
+              <w:autoSpaceDN w:val="0"/>
+              <w:adjustRightInd w:val="0"/>
+              <w:spacing w:before="0" w:line="240" w:lineRule="auto"/>
+              <w:rPr>
+                <w:rFonts w:eastAsia="Times New Roman" w:cs="Arial"/>
+                <w:b/>
+                <w:color w:val="EE0000"/>
+                <w:sz w:val="32"/>
+                <w:szCs w:val="32"/>
+                <w:lang w:val="it-IT" w:eastAsia="en-IN" w:bidi="ml-IN"/>
+              </w:rPr>
+            </w:pPr>
+            <w:r>
+              <w:rPr>
+                <w:rFonts w:cs="Arial"/>
+                <w:b/>
+                <w:bCs/>
+                <w:color w:val="EE0000"/>
+                <w:sz w:val="28"/>
+                <w:szCs w:val="36"/>
+                <w:lang w:val="it-IT" w:bidi="ml-IN"/>
+              </w:rPr>
+              <w:t>Panchaati No. 1</w:t>
+            </w:r>
+            <w:r>
+              <w:rPr>
+                <w:rFonts w:cs="Arial"/>
+                <w:b/>
+                <w:bCs/>
+                <w:color w:val="EE0000"/>
+                <w:sz w:val="28"/>
+                <w:szCs w:val="36"/>
+                <w:lang w:val="it-IT" w:bidi="ml-IN"/>
+              </w:rPr>
+              <w:t>7</w:t>
+            </w:r>
+          </w:p>
+        </w:tc>
+        <w:tc>
+          <w:tcPr>
+            <w:tcW w:w="5102" w:type="dxa"/>
+            <w:tcBorders>
+              <w:top w:val="single" w:sz="4" w:space="0" w:color="000000"/>
+              <w:left w:val="single" w:sz="4" w:space="0" w:color="000000"/>
+              <w:bottom w:val="single" w:sz="4" w:space="0" w:color="000000"/>
+              <w:right w:val="single" w:sz="4" w:space="0" w:color="000000"/>
+            </w:tcBorders>
+          </w:tcPr>
+          <w:p>
+            <w:pPr>
+              <w:widowControl w:val="0"/>
+              <w:autoSpaceDE w:val="0"/>
+              <w:autoSpaceDN w:val="0"/>
+              <w:adjustRightInd w:val="0"/>
+              <w:spacing w:before="0" w:line="240" w:lineRule="auto"/>
+              <w:rPr>
+                <w:rFonts w:ascii="BRH Malayalam Extra" w:hAnsi="BRH Malayalam Extra" w:cs="BRH Malayalam Extra"/>
+                <w:color w:val="EE0000"/>
+                <w:sz w:val="40"/>
+                <w:szCs w:val="40"/>
+              </w:rPr>
+            </w:pPr>
+            <w:r>
+              <w:rPr>
+                <w:rFonts w:ascii="BRH Malayalam Extra" w:hAnsi="BRH Malayalam Extra" w:cs="BRH Malayalam Extra"/>
+                <w:color w:val="EE0000"/>
+                <w:sz w:val="40"/>
+                <w:szCs w:val="40"/>
+              </w:rPr>
+              <w:t>jRy—¥rçx AÆû</w:t>
+            </w:r>
+            <w:r>
+              <w:rPr>
+                <w:rFonts w:ascii="BRH Malayalam Extra" w:hAnsi="BRH Malayalam Extra" w:cs="BRH Malayalam Extra"/>
+                <w:b/>
+                <w:color w:val="EE0000"/>
+                <w:sz w:val="32"/>
+                <w:szCs w:val="40"/>
+              </w:rPr>
+              <w:t>–</w:t>
+            </w:r>
+            <w:r>
+              <w:rPr>
+                <w:rFonts w:ascii="BRH Malayalam Extra" w:hAnsi="BRH Malayalam Extra" w:cs="BRH Malayalam Extra"/>
+                <w:color w:val="EE0000"/>
+                <w:sz w:val="40"/>
+                <w:szCs w:val="40"/>
+              </w:rPr>
+              <w:t xml:space="preserve">¥kr¡— | </w:t>
+            </w:r>
+          </w:p>
+          <w:p>
+            <w:pPr>
+              <w:widowControl w:val="0"/>
+              <w:autoSpaceDE w:val="0"/>
+              <w:autoSpaceDN w:val="0"/>
+              <w:adjustRightInd w:val="0"/>
+              <w:spacing w:before="0" w:line="240" w:lineRule="auto"/>
+              <w:rPr>
+                <w:rFonts w:ascii="BRH Malayalam Extra" w:hAnsi="BRH Malayalam Extra" w:cs="BRH Malayalam Extra"/>
+                <w:color w:val="EE0000"/>
+                <w:sz w:val="40"/>
+                <w:szCs w:val="40"/>
+              </w:rPr>
+            </w:pPr>
+            <w:r>
+              <w:rPr>
+                <w:rFonts w:ascii="BRH Malayalam Extra" w:hAnsi="BRH Malayalam Extra" w:cs="BRH Malayalam Extra"/>
+                <w:color w:val="EE0000"/>
+                <w:sz w:val="40"/>
+                <w:szCs w:val="40"/>
+              </w:rPr>
+              <w:t>A</w:t>
+            </w:r>
+            <w:r>
+              <w:rPr>
+                <w:rFonts w:ascii="BRH Malayalam Extra" w:hAnsi="BRH Malayalam Extra" w:cs="BRH Malayalam Extra"/>
+                <w:b/>
+                <w:color w:val="EE0000"/>
+                <w:sz w:val="32"/>
+                <w:szCs w:val="40"/>
+              </w:rPr>
+              <w:t>–</w:t>
+            </w:r>
+            <w:r>
+              <w:rPr>
+                <w:rFonts w:ascii="BRH Malayalam Extra" w:hAnsi="BRH Malayalam Extra" w:cs="BRH Malayalam Extra"/>
+                <w:color w:val="EE0000"/>
+                <w:sz w:val="40"/>
+                <w:szCs w:val="40"/>
+              </w:rPr>
+              <w:t>Æû</w:t>
+            </w:r>
+            <w:r>
+              <w:rPr>
+                <w:rFonts w:ascii="BRH Malayalam Extra" w:hAnsi="BRH Malayalam Extra" w:cs="BRH Malayalam Extra"/>
+                <w:b/>
+                <w:color w:val="EE0000"/>
+                <w:sz w:val="32"/>
+                <w:szCs w:val="40"/>
+              </w:rPr>
+              <w:t>–</w:t>
+            </w:r>
+            <w:r>
+              <w:rPr>
+                <w:rFonts w:ascii="BRH Malayalam Extra" w:hAnsi="BRH Malayalam Extra" w:cs="BRH Malayalam Extra"/>
+                <w:color w:val="EE0000"/>
+                <w:sz w:val="40"/>
+                <w:szCs w:val="40"/>
+              </w:rPr>
+              <w:t>¥k</w:t>
+            </w:r>
+            <w:r>
+              <w:rPr>
+                <w:rFonts w:ascii="BRH Malayalam Extra" w:hAnsi="BRH Malayalam Extra" w:cs="BRH Malayalam Extra"/>
+                <w:color w:val="EE0000"/>
+                <w:sz w:val="40"/>
+                <w:szCs w:val="40"/>
+                <w:highlight w:val="yellow"/>
+              </w:rPr>
+              <w:t>r</w:t>
+            </w:r>
+            <w:r>
+              <w:rPr>
+                <w:rFonts w:ascii="BRH Malayalam Extra" w:hAnsi="BRH Malayalam Extra" w:cs="BRH Malayalam Extra"/>
+                <w:color w:val="EE0000"/>
+                <w:sz w:val="40"/>
+                <w:szCs w:val="40"/>
+              </w:rPr>
+              <w:t xml:space="preserve">æzWõ—J | </w:t>
+            </w:r>
+          </w:p>
+        </w:tc>
+        <w:tc>
+          <w:tcPr>
+            <w:tcW w:w="5103" w:type="dxa"/>
+            <w:tcBorders>
+              <w:top w:val="single" w:sz="4" w:space="0" w:color="000000"/>
+              <w:left w:val="single" w:sz="4" w:space="0" w:color="000000"/>
+              <w:bottom w:val="single" w:sz="4" w:space="0" w:color="000000"/>
+              <w:right w:val="single" w:sz="4" w:space="0" w:color="000000"/>
+            </w:tcBorders>
+          </w:tcPr>
+          <w:p>
+            <w:pPr>
+              <w:autoSpaceDE w:val="0"/>
+              <w:autoSpaceDN w:val="0"/>
+              <w:adjustRightInd w:val="0"/>
+              <w:spacing w:before="0" w:line="240" w:lineRule="auto"/>
+              <w:rPr>
+                <w:rFonts w:ascii="BRH Malayalam Extra" w:hAnsi="BRH Malayalam Extra" w:cs="BRH Malayalam Extra"/>
+                <w:color w:val="EE0000"/>
+                <w:sz w:val="40"/>
+                <w:szCs w:val="40"/>
+              </w:rPr>
+            </w:pPr>
+            <w:r>
+              <w:rPr>
+                <w:rFonts w:ascii="BRH Malayalam Extra" w:hAnsi="BRH Malayalam Extra" w:cs="BRH Malayalam Extra"/>
+                <w:color w:val="EE0000"/>
+                <w:sz w:val="40"/>
+                <w:szCs w:val="40"/>
+              </w:rPr>
+              <w:t>jRy—¥rçx AÆû</w:t>
+            </w:r>
+            <w:r>
+              <w:rPr>
+                <w:rFonts w:ascii="BRH Malayalam Extra" w:hAnsi="BRH Malayalam Extra" w:cs="BRH Malayalam Extra"/>
+                <w:b/>
+                <w:color w:val="EE0000"/>
+                <w:sz w:val="32"/>
+                <w:szCs w:val="40"/>
+              </w:rPr>
+              <w:t>–</w:t>
+            </w:r>
+            <w:r>
+              <w:rPr>
+                <w:rFonts w:ascii="BRH Malayalam Extra" w:hAnsi="BRH Malayalam Extra" w:cs="BRH Malayalam Extra"/>
+                <w:color w:val="EE0000"/>
+                <w:sz w:val="40"/>
+                <w:szCs w:val="40"/>
+              </w:rPr>
+              <w:t xml:space="preserve">¥kr¡— | </w:t>
+            </w:r>
+          </w:p>
+          <w:p>
+            <w:pPr>
+              <w:autoSpaceDE w:val="0"/>
+              <w:autoSpaceDN w:val="0"/>
+              <w:adjustRightInd w:val="0"/>
+              <w:spacing w:before="0" w:line="240" w:lineRule="auto"/>
+              <w:rPr>
+                <w:rFonts w:ascii="BRH Malayalam Extra" w:hAnsi="BRH Malayalam Extra" w:cs="BRH Malayalam Extra"/>
+                <w:color w:val="EE0000"/>
+                <w:sz w:val="40"/>
+                <w:szCs w:val="40"/>
+              </w:rPr>
+            </w:pPr>
+            <w:r>
+              <w:rPr>
+                <w:rFonts w:ascii="BRH Malayalam Extra" w:hAnsi="BRH Malayalam Extra" w:cs="BRH Malayalam Extra"/>
+                <w:color w:val="EE0000"/>
+                <w:sz w:val="40"/>
+                <w:szCs w:val="40"/>
+              </w:rPr>
+              <w:t>A</w:t>
+            </w:r>
+            <w:r>
+              <w:rPr>
+                <w:rFonts w:ascii="BRH Malayalam Extra" w:hAnsi="BRH Malayalam Extra" w:cs="BRH Malayalam Extra"/>
+                <w:b/>
+                <w:color w:val="EE0000"/>
+                <w:sz w:val="32"/>
+                <w:szCs w:val="40"/>
+              </w:rPr>
+              <w:t>–</w:t>
+            </w:r>
+            <w:r>
+              <w:rPr>
+                <w:rFonts w:ascii="BRH Malayalam Extra" w:hAnsi="BRH Malayalam Extra" w:cs="BRH Malayalam Extra"/>
+                <w:color w:val="EE0000"/>
+                <w:sz w:val="40"/>
+                <w:szCs w:val="40"/>
+              </w:rPr>
+              <w:t>Æû</w:t>
+            </w:r>
+            <w:r>
+              <w:rPr>
+                <w:rFonts w:ascii="BRH Malayalam Extra" w:hAnsi="BRH Malayalam Extra" w:cs="BRH Malayalam Extra"/>
+                <w:b/>
+                <w:color w:val="EE0000"/>
+                <w:sz w:val="32"/>
+                <w:szCs w:val="40"/>
+              </w:rPr>
+              <w:t>–</w:t>
+            </w:r>
+            <w:r>
+              <w:rPr>
+                <w:rFonts w:ascii="BRH Malayalam Extra" w:hAnsi="BRH Malayalam Extra" w:cs="BRH Malayalam Extra"/>
+                <w:color w:val="EE0000"/>
+                <w:sz w:val="40"/>
+                <w:szCs w:val="40"/>
+              </w:rPr>
+              <w:t>¥k</w:t>
+            </w:r>
+            <w:r>
+              <w:rPr>
+                <w:rFonts w:ascii="BRH Malayalam Extra" w:hAnsi="BRH Malayalam Extra" w:cs="BRH Malayalam Extra"/>
+                <w:color w:val="EE0000"/>
+                <w:sz w:val="40"/>
+                <w:szCs w:val="40"/>
+                <w:highlight w:val="green"/>
+              </w:rPr>
+              <w:t>rûz</w:t>
+            </w:r>
+            <w:r>
+              <w:rPr>
+                <w:rFonts w:ascii="BRH Malayalam Extra" w:hAnsi="BRH Malayalam Extra" w:cs="BRH Malayalam Extra"/>
+                <w:color w:val="EE0000"/>
+                <w:sz w:val="40"/>
+                <w:szCs w:val="40"/>
+              </w:rPr>
+              <w:t>Wõ—J |</w:t>
+            </w:r>
+          </w:p>
+        </w:tc>
+      </w:tr>
+      <w:tr>
+        <w:trPr>
           <w:trHeight w:val="1105"/>
         </w:trPr>
         <w:tc>
@@ -810,17 +1233,7 @@
                 <w:szCs w:val="32"/>
                 <w:lang w:val="en-IN" w:eastAsia="en-IN" w:bidi="ml-IN"/>
               </w:rPr>
-              <w:t>11.</w:t>
-            </w:r>
-            <w:r>
-              <w:rPr>
-                <w:rFonts w:eastAsia="Times New Roman" w:cs="Arial"/>
-                <w:b/>
-                <w:sz w:val="32"/>
-                <w:szCs w:val="32"/>
-                <w:lang w:val="en-IN" w:eastAsia="en-IN" w:bidi="ml-IN"/>
-              </w:rPr>
-              <w:t>2</w:t>
+              <w:t>11.2</w:t>
             </w:r>
             <w:r>
               <w:rPr>
@@ -847,7 +1260,7 @@
                 <w:rFonts w:eastAsia="Times New Roman" w:cs="Arial"/>
                 <w:b/>
                 <w:szCs w:val="24"/>
-                <w:lang w:val="it-IT" w:eastAsia="en-IN" w:bidi="ml-IN"/>
+                <w:lang w:val="en-IN" w:eastAsia="en-IN" w:bidi="ml-IN"/>
               </w:rPr>
             </w:pPr>
             <w:r>
@@ -855,18 +1268,9 @@
                 <w:rFonts w:eastAsia="Times New Roman" w:cs="Arial"/>
                 <w:b/>
                 <w:szCs w:val="24"/>
-                <w:lang w:val="it-IT" w:eastAsia="en-IN" w:bidi="ml-IN"/>
-              </w:rPr>
-              <w:t xml:space="preserve">Krama Vaakyam No. </w:t>
-            </w:r>
-            <w:r>
-              <w:rPr>
-                <w:rFonts w:eastAsia="Times New Roman" w:cs="Arial"/>
-                <w:b/>
-                <w:szCs w:val="24"/>
-                <w:lang w:val="it-IT" w:eastAsia="en-IN" w:bidi="ml-IN"/>
-              </w:rPr>
-              <w:t>46, 47</w:t>
+                <w:lang w:val="en-IN" w:eastAsia="en-IN" w:bidi="ml-IN"/>
+              </w:rPr>
+              <w:t>Krama Vaakyam No. 46, 47</w:t>
             </w:r>
           </w:p>
           <w:p>
@@ -1610,6 +2014,7 @@
           <w:u w:val="single"/>
           <w:lang w:val="it-IT"/>
         </w:rPr>
+        <w:lastRenderedPageBreak/>
         <w:t>==========</w:t>
       </w:r>
     </w:p>
@@ -1657,7 +2062,6 @@
           <w:szCs w:val="32"/>
           <w:u w:val="single"/>
         </w:rPr>
-        <w:lastRenderedPageBreak/>
         <w:t xml:space="preserve">TS </w:t>
       </w:r>
       <w:r>
@@ -3533,6 +3937,7 @@
                 <w:szCs w:val="32"/>
                 <w:lang w:val="en-IN" w:eastAsia="en-IN" w:bidi="ml-IN"/>
               </w:rPr>
+              <w:lastRenderedPageBreak/>
               <w:t>T.S.1.5.</w:t>
             </w:r>
             <w:r>
@@ -3878,7 +4283,6 @@
                 <w:szCs w:val="32"/>
                 <w:lang w:val="en-IN" w:eastAsia="en-IN" w:bidi="ml-IN"/>
               </w:rPr>
-              <w:lastRenderedPageBreak/>
               <w:t>T.S.1.5.</w:t>
             </w:r>
             <w:r>
@@ -5744,6 +6148,7 @@
                 <w:szCs w:val="40"/>
                 <w:lang w:val="it-IT"/>
               </w:rPr>
+              <w:lastRenderedPageBreak/>
               <w:t>s¡ - i</w:t>
             </w:r>
             <w:r>
@@ -5817,6 +6222,7 @@
                 <w:szCs w:val="40"/>
                 <w:lang w:val="it-IT"/>
               </w:rPr>
+              <w:lastRenderedPageBreak/>
               <w:t>s¡</w:t>
             </w:r>
             <w:r>
@@ -6029,6 +6435,7 @@
                 <w:szCs w:val="40"/>
                 <w:lang w:val="it-IT"/>
               </w:rPr>
+              <w:lastRenderedPageBreak/>
               <w:t>s¡ - i</w:t>
             </w:r>
             <w:r>
@@ -7574,6 +7981,7 @@
                 <w:szCs w:val="32"/>
                 <w:lang w:val="en-IN" w:eastAsia="en-IN" w:bidi="ml-IN"/>
               </w:rPr>
+              <w:lastRenderedPageBreak/>
               <w:t>T.S.1.5.4.2 - Kramam</w:t>
             </w:r>
           </w:p>
@@ -7883,7 +8291,6 @@
                 <w:szCs w:val="32"/>
                 <w:lang w:val="en-IN" w:eastAsia="en-IN" w:bidi="ml-IN"/>
               </w:rPr>
-              <w:lastRenderedPageBreak/>
               <w:t>T.S.1.5.7.6 - Kramam</w:t>
             </w:r>
           </w:p>
@@ -9961,7 +10368,16 @@
           <w:bCs/>
           <w:sz w:val="32"/>
         </w:rPr>
-        <w:t>replaced with</w:t>
+        <w:t xml:space="preserve">replaced </w:t>
+      </w:r>
+      <w:proofErr w:type="gramStart"/>
+      <w:r>
+        <w:rPr>
+          <w:b/>
+          <w:bCs/>
+          <w:sz w:val="32"/>
+        </w:rPr>
+        <w:t>with</w:t>
       </w:r>
       <w:r>
         <w:rPr>
@@ -9981,7 +10397,29 @@
           <w:szCs w:val="40"/>
           <w:lang w:val="en-IN" w:eastAsia="en-IN"/>
         </w:rPr>
-        <w:t xml:space="preserve">"q§T"  </w:t>
+        <w:t>"</w:t>
+      </w:r>
+      <w:proofErr w:type="gramEnd"/>
+      <w:r>
+        <w:rPr>
+          <w:rFonts w:ascii="BRH Malayalam" w:hAnsi="BRH Malayalam" w:cs="BRH Malayalam"/>
+          <w:color w:val="000000"/>
+          <w:sz w:val="40"/>
+          <w:szCs w:val="40"/>
+          <w:lang w:val="en-IN" w:eastAsia="en-IN"/>
+        </w:rPr>
+        <w:t>q§T</w:t>
+      </w:r>
+      <w:proofErr w:type="gramStart"/>
+      <w:r>
+        <w:rPr>
+          <w:rFonts w:ascii="BRH Malayalam" w:hAnsi="BRH Malayalam" w:cs="BRH Malayalam"/>
+          <w:color w:val="000000"/>
+          <w:sz w:val="40"/>
+          <w:szCs w:val="40"/>
+          <w:lang w:val="en-IN" w:eastAsia="en-IN"/>
+        </w:rPr>
+        <w:t xml:space="preserve">"  </w:t>
       </w:r>
       <w:r>
         <w:rPr>
@@ -9989,7 +10427,16 @@
           <w:bCs/>
           <w:sz w:val="32"/>
         </w:rPr>
-        <w:t>wherever applicable</w:t>
+        <w:t>wherever</w:t>
+      </w:r>
+      <w:proofErr w:type="gramEnd"/>
+      <w:r>
+        <w:rPr>
+          <w:b/>
+          <w:bCs/>
+          <w:sz w:val="32"/>
+        </w:rPr>
+        <w:t xml:space="preserve"> applicable</w:t>
       </w:r>
     </w:p>
     <w:p>
@@ -10011,6 +10458,7 @@
           <w:szCs w:val="32"/>
           <w:u w:val="single"/>
         </w:rPr>
+        <w:lastRenderedPageBreak/>
         <w:t>==============================</w:t>
       </w:r>
     </w:p>
@@ -10045,7 +10493,6 @@
           <w:szCs w:val="32"/>
           <w:u w:val="single"/>
         </w:rPr>
-        <w:lastRenderedPageBreak/>
         <w:t xml:space="preserve">TS </w:t>
       </w:r>
       <w:r>
@@ -11776,6 +12223,7 @@
                 <w:szCs w:val="32"/>
                 <w:lang w:val="en-IN" w:eastAsia="en-IN" w:bidi="ml-IN"/>
               </w:rPr>
+              <w:lastRenderedPageBreak/>
               <w:t>T.S.1.5.4.1</w:t>
             </w:r>
             <w:r>
@@ -12124,7 +12572,6 @@
                 <w:szCs w:val="32"/>
                 <w:lang w:val="en-IN" w:eastAsia="en-IN" w:bidi="ml-IN"/>
               </w:rPr>
-              <w:lastRenderedPageBreak/>
               <w:t>T.S.1.5.4.1</w:t>
             </w:r>
             <w:r>
@@ -13945,6 +14392,7 @@
                 <w:szCs w:val="32"/>
                 <w:lang w:val="en-IN" w:eastAsia="en-IN" w:bidi="ml-IN"/>
               </w:rPr>
+              <w:lastRenderedPageBreak/>
               <w:t>T.S.1.5.8.1</w:t>
             </w:r>
             <w:r>
@@ -14185,7 +14633,6 @@
           <w:szCs w:val="32"/>
           <w:u w:val="single"/>
         </w:rPr>
-        <w:lastRenderedPageBreak/>
         <w:t xml:space="preserve">TS </w:t>
       </w:r>
       <w:r>
@@ -14734,8 +15181,9 @@
                 <w:szCs w:val="28"/>
                 <w:lang w:bidi="ml-IN"/>
               </w:rPr>
-              <w:t>(tri kramam</w:t>
-            </w:r>
+              <w:t>(</w:t>
+            </w:r>
+            <w:proofErr w:type="gramStart"/>
             <w:r>
               <w:rPr>
                 <w:rFonts w:cs="Arial"/>
@@ -14744,8 +15192,9 @@
                 <w:szCs w:val="28"/>
                 <w:lang w:bidi="ml-IN"/>
               </w:rPr>
-              <w:t xml:space="preserve"> indicat</w:t>
-            </w:r>
+              <w:t>tri</w:t>
+            </w:r>
+            <w:proofErr w:type="gramEnd"/>
             <w:r>
               <w:rPr>
                 <w:rFonts w:cs="Arial"/>
@@ -14754,7 +15203,7 @@
                 <w:szCs w:val="28"/>
                 <w:lang w:bidi="ml-IN"/>
               </w:rPr>
-              <w:t xml:space="preserve">ion not given/missed </w:t>
+              <w:t xml:space="preserve"> kramam</w:t>
             </w:r>
             <w:r>
               <w:rPr>
@@ -14764,7 +15213,37 @@
                 <w:szCs w:val="28"/>
                 <w:lang w:bidi="ml-IN"/>
               </w:rPr>
+              <w:t xml:space="preserve"> indicat</w:t>
+            </w:r>
+            <w:r>
+              <w:rPr>
+                <w:rFonts w:cs="Arial"/>
+                <w:color w:val="000000"/>
+                <w:sz w:val="28"/>
+                <w:szCs w:val="28"/>
+                <w:lang w:bidi="ml-IN"/>
+              </w:rPr>
+              <w:t xml:space="preserve">ion not given/missed </w:t>
+            </w:r>
+            <w:r>
+              <w:rPr>
+                <w:rFonts w:cs="Arial"/>
+                <w:color w:val="000000"/>
+                <w:sz w:val="28"/>
+                <w:szCs w:val="28"/>
+                <w:lang w:bidi="ml-IN"/>
+              </w:rPr>
               <w:br/>
+            </w:r>
+            <w:proofErr w:type="gramStart"/>
+            <w:r>
+              <w:rPr>
+                <w:rFonts w:cs="Arial"/>
+                <w:color w:val="000000"/>
+                <w:sz w:val="28"/>
+                <w:szCs w:val="28"/>
+                <w:lang w:bidi="ml-IN"/>
+              </w:rPr>
               <w:t xml:space="preserve">add </w:t>
             </w:r>
             <w:r>
@@ -14785,7 +15264,18 @@
                 <w:szCs w:val="36"/>
                 <w:highlight w:val="green"/>
               </w:rPr>
-              <w:t>„„</w:t>
+              <w:t>„</w:t>
+            </w:r>
+            <w:proofErr w:type="gramEnd"/>
+            <w:r>
+              <w:rPr>
+                <w:rFonts w:ascii="BRH Malayalam Extra" w:hAnsi="BRH Malayalam Extra" w:cs="BRH Malayalam Extra"/>
+                <w:color w:val="000000"/>
+                <w:sz w:val="36"/>
+                <w:szCs w:val="36"/>
+                <w:highlight w:val="green"/>
+              </w:rPr>
+              <w:t>„</w:t>
             </w:r>
             <w:r>
               <w:rPr>
@@ -15259,6 +15749,7 @@
           <w:b/>
           <w:sz w:val="32"/>
         </w:rPr>
+        <w:lastRenderedPageBreak/>
         <w:t>=========================</w:t>
       </w:r>
     </w:p>

</xml_diff>

<commit_message>
nmv 07 05 2026
</commit_message>
<xml_diff>
--- a/TS-Kramam/TS-1.5/TS 1.5 Malayalam Krama Paatam Corrections.docx
+++ b/TS-Kramam/TS-1.5/TS 1.5 Malayalam Krama Paatam Corrections.docx
@@ -503,29 +503,7 @@
                 <w:szCs w:val="32"/>
                 <w:lang w:val="en-IN" w:eastAsia="en-IN" w:bidi="ml-IN"/>
               </w:rPr>
-              <w:t>T.S.1.5.5.</w:t>
-            </w:r>
-            <w:r>
-              <w:rPr>
-                <w:rFonts w:eastAsia="Times New Roman" w:cs="Arial"/>
-                <w:b/>
-                <w:color w:val="EE0000"/>
-                <w:sz w:val="32"/>
-                <w:szCs w:val="32"/>
-                <w:lang w:val="en-IN" w:eastAsia="en-IN" w:bidi="ml-IN"/>
-              </w:rPr>
-              <w:t>1</w:t>
-            </w:r>
-            <w:r>
-              <w:rPr>
-                <w:rFonts w:eastAsia="Times New Roman" w:cs="Arial"/>
-                <w:b/>
-                <w:color w:val="EE0000"/>
-                <w:sz w:val="32"/>
-                <w:szCs w:val="32"/>
-                <w:lang w:val="en-IN" w:eastAsia="en-IN" w:bidi="ml-IN"/>
-              </w:rPr>
-              <w:t xml:space="preserve"> - Kramam</w:t>
+              <w:t>T.S.1.5.5.1 - Kramam</w:t>
             </w:r>
           </w:p>
           <w:p>
@@ -542,7 +520,7 @@
                 <w:color w:val="EE0000"/>
                 <w:sz w:val="28"/>
                 <w:szCs w:val="36"/>
-                <w:lang w:val="it-IT" w:bidi="ml-IN"/>
+                <w:lang w:val="en-IN" w:bidi="ml-IN"/>
               </w:rPr>
             </w:pPr>
             <w:r>
@@ -553,21 +531,9 @@
                 <w:color w:val="EE0000"/>
                 <w:sz w:val="28"/>
                 <w:szCs w:val="36"/>
-                <w:lang w:val="it-IT" w:bidi="ml-IN"/>
-              </w:rPr>
-              <w:t xml:space="preserve">Krama Vaakyam No. </w:t>
-            </w:r>
-            <w:r>
-              <w:rPr>
-                <w:rFonts w:cs="Arial"/>
-                <w:b/>
-                <w:bCs/>
-                <w:color w:val="EE0000"/>
-                <w:sz w:val="28"/>
-                <w:szCs w:val="36"/>
-                <w:lang w:val="it-IT" w:bidi="ml-IN"/>
-              </w:rPr>
-              <w:t>41</w:t>
+                <w:lang w:val="en-IN" w:bidi="ml-IN"/>
+              </w:rPr>
+              <w:t>Krama Vaakyam No. 41</w:t>
             </w:r>
           </w:p>
           <w:p>
@@ -599,19 +565,7 @@
                 <w:szCs w:val="36"/>
                 <w:lang w:val="it-IT" w:bidi="ml-IN"/>
               </w:rPr>
-              <w:t>Panchaati No. 1</w:t>
-            </w:r>
-            <w:r>
-              <w:rPr>
-                <w:rFonts w:cs="Arial"/>
-                <w:b/>
-                <w:bCs/>
-                <w:color w:val="EE0000"/>
-                <w:sz w:val="28"/>
-                <w:szCs w:val="36"/>
-                <w:lang w:val="it-IT" w:bidi="ml-IN"/>
-              </w:rPr>
-              <w:t>7</w:t>
+              <w:t>Panchaati No. 17</w:t>
             </w:r>
           </w:p>
         </w:tc>
@@ -637,6 +591,7 @@
                 <w:color w:val="EE0000"/>
                 <w:sz w:val="40"/>
                 <w:szCs w:val="40"/>
+                <w:lang w:val="it-IT"/>
               </w:rPr>
             </w:pPr>
             <w:r>
@@ -645,6 +600,7 @@
                 <w:color w:val="EE0000"/>
                 <w:sz w:val="40"/>
                 <w:szCs w:val="40"/>
+                <w:lang w:val="it-IT"/>
               </w:rPr>
               <w:t>jRy—¥rçx AÆû</w:t>
             </w:r>
@@ -655,6 +611,7 @@
                 <w:color w:val="EE0000"/>
                 <w:sz w:val="32"/>
                 <w:szCs w:val="40"/>
+                <w:lang w:val="it-IT"/>
               </w:rPr>
               <w:t>–</w:t>
             </w:r>
@@ -664,6 +621,7 @@
                 <w:color w:val="EE0000"/>
                 <w:sz w:val="40"/>
                 <w:szCs w:val="40"/>
+                <w:lang w:val="it-IT"/>
               </w:rPr>
               <w:t xml:space="preserve">¥kr¡— | </w:t>
             </w:r>
@@ -680,6 +638,7 @@
                 <w:color w:val="EE0000"/>
                 <w:sz w:val="40"/>
                 <w:szCs w:val="40"/>
+                <w:lang w:val="it-IT"/>
               </w:rPr>
             </w:pPr>
             <w:r>
@@ -688,6 +647,7 @@
                 <w:color w:val="EE0000"/>
                 <w:sz w:val="40"/>
                 <w:szCs w:val="40"/>
+                <w:lang w:val="it-IT"/>
               </w:rPr>
               <w:t>A</w:t>
             </w:r>
@@ -698,6 +658,7 @@
                 <w:color w:val="EE0000"/>
                 <w:sz w:val="32"/>
                 <w:szCs w:val="40"/>
+                <w:lang w:val="it-IT"/>
               </w:rPr>
               <w:t>–</w:t>
             </w:r>
@@ -707,6 +668,7 @@
                 <w:color w:val="EE0000"/>
                 <w:sz w:val="40"/>
                 <w:szCs w:val="40"/>
+                <w:lang w:val="it-IT"/>
               </w:rPr>
               <w:t>Æû</w:t>
             </w:r>
@@ -717,6 +679,7 @@
                 <w:color w:val="EE0000"/>
                 <w:sz w:val="32"/>
                 <w:szCs w:val="40"/>
+                <w:lang w:val="it-IT"/>
               </w:rPr>
               <w:t>–</w:t>
             </w:r>
@@ -726,6 +689,7 @@
                 <w:color w:val="EE0000"/>
                 <w:sz w:val="40"/>
                 <w:szCs w:val="40"/>
+                <w:lang w:val="it-IT"/>
               </w:rPr>
               <w:t>¥k</w:t>
             </w:r>
@@ -736,6 +700,7 @@
                 <w:sz w:val="40"/>
                 <w:szCs w:val="40"/>
                 <w:highlight w:val="yellow"/>
+                <w:lang w:val="it-IT"/>
               </w:rPr>
               <w:t>r</w:t>
             </w:r>
@@ -745,6 +710,7 @@
                 <w:color w:val="EE0000"/>
                 <w:sz w:val="40"/>
                 <w:szCs w:val="40"/>
+                <w:lang w:val="it-IT"/>
               </w:rPr>
               <w:t xml:space="preserve">æzWõ—J | </w:t>
             </w:r>
@@ -771,6 +737,7 @@
                 <w:color w:val="EE0000"/>
                 <w:sz w:val="40"/>
                 <w:szCs w:val="40"/>
+                <w:lang w:val="it-IT"/>
               </w:rPr>
             </w:pPr>
             <w:r>
@@ -779,6 +746,7 @@
                 <w:color w:val="EE0000"/>
                 <w:sz w:val="40"/>
                 <w:szCs w:val="40"/>
+                <w:lang w:val="it-IT"/>
               </w:rPr>
               <w:t>jRy—¥rçx AÆû</w:t>
             </w:r>
@@ -789,6 +757,7 @@
                 <w:color w:val="EE0000"/>
                 <w:sz w:val="32"/>
                 <w:szCs w:val="40"/>
+                <w:lang w:val="it-IT"/>
               </w:rPr>
               <w:t>–</w:t>
             </w:r>
@@ -798,6 +767,7 @@
                 <w:color w:val="EE0000"/>
                 <w:sz w:val="40"/>
                 <w:szCs w:val="40"/>
+                <w:lang w:val="it-IT"/>
               </w:rPr>
               <w:t xml:space="preserve">¥kr¡— | </w:t>
             </w:r>
@@ -813,6 +783,7 @@
                 <w:color w:val="EE0000"/>
                 <w:sz w:val="40"/>
                 <w:szCs w:val="40"/>
+                <w:lang w:val="it-IT"/>
               </w:rPr>
             </w:pPr>
             <w:r>
@@ -821,6 +792,7 @@
                 <w:color w:val="EE0000"/>
                 <w:sz w:val="40"/>
                 <w:szCs w:val="40"/>
+                <w:lang w:val="it-IT"/>
               </w:rPr>
               <w:t>A</w:t>
             </w:r>
@@ -831,6 +803,7 @@
                 <w:color w:val="EE0000"/>
                 <w:sz w:val="32"/>
                 <w:szCs w:val="40"/>
+                <w:lang w:val="it-IT"/>
               </w:rPr>
               <w:t>–</w:t>
             </w:r>
@@ -840,6 +813,7 @@
                 <w:color w:val="EE0000"/>
                 <w:sz w:val="40"/>
                 <w:szCs w:val="40"/>
+                <w:lang w:val="it-IT"/>
               </w:rPr>
               <w:t>Æû</w:t>
             </w:r>
@@ -850,6 +824,7 @@
                 <w:color w:val="EE0000"/>
                 <w:sz w:val="32"/>
                 <w:szCs w:val="40"/>
+                <w:lang w:val="it-IT"/>
               </w:rPr>
               <w:t>–</w:t>
             </w:r>
@@ -859,6 +834,7 @@
                 <w:color w:val="EE0000"/>
                 <w:sz w:val="40"/>
                 <w:szCs w:val="40"/>
+                <w:lang w:val="it-IT"/>
               </w:rPr>
               <w:t>¥k</w:t>
             </w:r>
@@ -869,6 +845,7 @@
                 <w:sz w:val="40"/>
                 <w:szCs w:val="40"/>
                 <w:highlight w:val="green"/>
+                <w:lang w:val="it-IT"/>
               </w:rPr>
               <w:t>rûz</w:t>
             </w:r>
@@ -878,6 +855,7 @@
                 <w:color w:val="EE0000"/>
                 <w:sz w:val="40"/>
                 <w:szCs w:val="40"/>
+                <w:lang w:val="it-IT"/>
               </w:rPr>
               <w:t>Wõ—J |</w:t>
             </w:r>
@@ -1185,7 +1163,7 @@
       </w:tr>
       <w:tr>
         <w:trPr>
-          <w:trHeight w:val="2413"/>
+          <w:trHeight w:val="1266"/>
         </w:trPr>
         <w:tc>
           <w:tcPr>
@@ -1210,6 +1188,7 @@
               <w:rPr>
                 <w:rFonts w:eastAsia="Times New Roman" w:cs="Arial"/>
                 <w:b/>
+                <w:color w:val="EE0000"/>
                 <w:sz w:val="32"/>
                 <w:szCs w:val="32"/>
                 <w:lang w:val="en-IN" w:eastAsia="en-IN" w:bidi="ml-IN"/>
@@ -1219,31 +1198,42 @@
               <w:rPr>
                 <w:rFonts w:eastAsia="Times New Roman" w:cs="Arial"/>
                 <w:b/>
+                <w:color w:val="EE0000"/>
                 <w:sz w:val="32"/>
                 <w:szCs w:val="32"/>
                 <w:lang w:val="en-IN" w:eastAsia="en-IN" w:bidi="ml-IN"/>
               </w:rPr>
-              <w:t>T.S.1.5.</w:t>
-            </w:r>
-            <w:r>
-              <w:rPr>
-                <w:rFonts w:eastAsia="Times New Roman" w:cs="Arial"/>
-                <w:b/>
-                <w:sz w:val="32"/>
-                <w:szCs w:val="32"/>
-                <w:lang w:val="en-IN" w:eastAsia="en-IN" w:bidi="ml-IN"/>
-              </w:rPr>
-              <w:t>11.2</w:t>
-            </w:r>
-            <w:r>
-              <w:rPr>
-                <w:rFonts w:eastAsia="Times New Roman" w:cs="Arial"/>
-                <w:b/>
-                <w:sz w:val="32"/>
-                <w:szCs w:val="32"/>
-                <w:lang w:val="en-IN" w:eastAsia="en-IN" w:bidi="ml-IN"/>
-              </w:rPr>
-              <w:t xml:space="preserve"> - Kramam</w:t>
+              <w:t>T.S.1.5.7.3 - Kramam</w:t>
+            </w:r>
+          </w:p>
+          <w:p>
+            <w:pPr>
+              <w:widowControl w:val="0"/>
+              <w:autoSpaceDE w:val="0"/>
+              <w:autoSpaceDN w:val="0"/>
+              <w:adjustRightInd w:val="0"/>
+              <w:spacing w:before="0" w:line="240" w:lineRule="auto"/>
+              <w:rPr>
+                <w:rFonts w:cs="Arial"/>
+                <w:b/>
+                <w:bCs/>
+                <w:color w:val="EE0000"/>
+                <w:sz w:val="28"/>
+                <w:szCs w:val="36"/>
+                <w:lang w:val="en-IN" w:bidi="ml-IN"/>
+              </w:rPr>
+            </w:pPr>
+            <w:r>
+              <w:rPr>
+                <w:rFonts w:cs="Arial"/>
+                <w:b/>
+                <w:bCs/>
+                <w:color w:val="EE0000"/>
+                <w:sz w:val="28"/>
+                <w:szCs w:val="36"/>
+                <w:lang w:val="en-IN" w:bidi="ml-IN"/>
+              </w:rPr>
+              <w:t>Krama Vaakyam No. 9</w:t>
             </w:r>
           </w:p>
           <w:p>
@@ -1259,57 +1249,23 @@
               <w:rPr>
                 <w:rFonts w:eastAsia="Times New Roman" w:cs="Arial"/>
                 <w:b/>
-                <w:szCs w:val="24"/>
+                <w:color w:val="EE0000"/>
+                <w:sz w:val="32"/>
+                <w:szCs w:val="32"/>
                 <w:lang w:val="en-IN" w:eastAsia="en-IN" w:bidi="ml-IN"/>
               </w:rPr>
             </w:pPr>
             <w:r>
               <w:rPr>
-                <w:rFonts w:eastAsia="Times New Roman" w:cs="Arial"/>
-                <w:b/>
-                <w:szCs w:val="24"/>
-                <w:lang w:val="en-IN" w:eastAsia="en-IN" w:bidi="ml-IN"/>
-              </w:rPr>
-              <w:t>Krama Vaakyam No. 46, 47</w:t>
-            </w:r>
-          </w:p>
-          <w:p>
-            <w:pPr>
-              <w:widowControl w:val="0"/>
-              <w:tabs>
-                <w:tab w:val="left" w:pos="993"/>
-              </w:tabs>
-              <w:autoSpaceDE w:val="0"/>
-              <w:autoSpaceDN w:val="0"/>
-              <w:adjustRightInd w:val="0"/>
-              <w:spacing w:before="0" w:line="240" w:lineRule="auto"/>
-              <w:rPr>
-                <w:rFonts w:eastAsia="Times New Roman" w:cs="Arial"/>
-                <w:b/>
-                <w:sz w:val="32"/>
-                <w:szCs w:val="32"/>
-                <w:lang w:val="it-IT" w:eastAsia="en-IN" w:bidi="ml-IN"/>
-              </w:rPr>
-            </w:pPr>
-            <w:r>
-              <w:rPr>
-                <w:rFonts w:eastAsia="Times New Roman" w:cs="Arial"/>
-                <w:b/>
-                <w:sz w:val="32"/>
-                <w:szCs w:val="32"/>
-                <w:lang w:val="it-IT" w:eastAsia="en-IN" w:bidi="ml-IN"/>
-              </w:rPr>
-              <w:t xml:space="preserve">Panchaati No. </w:t>
-            </w:r>
-            <w:r>
-              <w:rPr>
-                <w:rFonts w:eastAsia="Times New Roman" w:cs="Arial"/>
-                <w:b/>
-                <w:sz w:val="32"/>
-                <w:szCs w:val="32"/>
-                <w:lang w:val="it-IT" w:eastAsia="en-IN" w:bidi="ml-IN"/>
-              </w:rPr>
-              <w:t>48</w:t>
+                <w:rFonts w:cs="Arial"/>
+                <w:b/>
+                <w:bCs/>
+                <w:color w:val="EE0000"/>
+                <w:sz w:val="28"/>
+                <w:szCs w:val="36"/>
+                <w:lang w:val="it-IT" w:bidi="ml-IN"/>
+              </w:rPr>
+              <w:t>Panchaati No. 27</w:t>
             </w:r>
           </w:p>
         </w:tc>
@@ -1329,63 +1285,41 @@
               <w:autoSpaceDE w:val="0"/>
               <w:autoSpaceDN w:val="0"/>
               <w:adjustRightInd w:val="0"/>
-              <w:spacing w:line="252" w:lineRule="auto"/>
-              <w:rPr>
-                <w:rFonts w:ascii="BRH Malayalam Extra" w:hAnsi="BRH Malayalam Extra" w:cs="BRH Malayalam Extra"/>
-                <w:sz w:val="40"/>
-                <w:szCs w:val="40"/>
-              </w:rPr>
-            </w:pPr>
-            <w:r>
-              <w:rPr>
-                <w:rFonts w:ascii="BRH Malayalam Extra" w:hAnsi="BRH Malayalam Extra" w:cs="BRH Malayalam Extra"/>
-                <w:sz w:val="40"/>
-                <w:szCs w:val="40"/>
-              </w:rPr>
-              <w:t>i</w:t>
-            </w:r>
-            <w:r>
-              <w:rPr>
-                <w:rFonts w:ascii="BRH Malayalam Extra" w:hAnsi="BRH Malayalam Extra" w:cs="BRH Malayalam Extra"/>
-                <w:b/>
-                <w:sz w:val="32"/>
-                <w:szCs w:val="40"/>
-              </w:rPr>
-              <w:t>–</w:t>
-            </w:r>
-            <w:r>
-              <w:rPr>
-                <w:rFonts w:ascii="BRH Malayalam Extra" w:hAnsi="BRH Malayalam Extra" w:cs="BRH Malayalam Extra"/>
-                <w:sz w:val="40"/>
-                <w:szCs w:val="40"/>
-              </w:rPr>
-              <w:t>Np—a§s¡ cx</w:t>
-            </w:r>
-            <w:r>
-              <w:rPr>
-                <w:rFonts w:ascii="BRH Malayalam Extra" w:hAnsi="BRH Malayalam Extra" w:cs="BRH Malayalam Extra"/>
-                <w:sz w:val="40"/>
-                <w:szCs w:val="40"/>
-                <w:highlight w:val="yellow"/>
-              </w:rPr>
-              <w:t>k</w:t>
-            </w:r>
-            <w:r>
-              <w:rPr>
-                <w:rFonts w:ascii="BRH Malayalam Extra" w:hAnsi="BRH Malayalam Extra" w:cs="BRH Malayalam Extra"/>
-                <w:b/>
-                <w:sz w:val="32"/>
-                <w:szCs w:val="40"/>
-              </w:rPr>
-              <w:t>–</w:t>
-            </w:r>
-            <w:r>
-              <w:rPr>
-                <w:rFonts w:ascii="BRH Malayalam Extra" w:hAnsi="BRH Malayalam Extra" w:cs="BRH Malayalam Extra"/>
-                <w:sz w:val="40"/>
-                <w:szCs w:val="40"/>
-              </w:rPr>
-              <w:t xml:space="preserve">j | </w:t>
+              <w:spacing w:before="0" w:line="240" w:lineRule="auto"/>
+              <w:rPr>
+                <w:rFonts w:ascii="BRH Malayalam Extra" w:hAnsi="BRH Malayalam Extra" w:cs="BRH Malayalam Extra"/>
+                <w:color w:val="EE0000"/>
+                <w:sz w:val="40"/>
+                <w:szCs w:val="40"/>
+              </w:rPr>
+            </w:pPr>
+            <w:r>
+              <w:rPr>
+                <w:rFonts w:ascii="BRH Malayalam Extra" w:hAnsi="BRH Malayalam Extra" w:cs="BRH Malayalam Extra"/>
+                <w:color w:val="EE0000"/>
+                <w:sz w:val="40"/>
+                <w:szCs w:val="40"/>
+              </w:rPr>
+              <w:t>DÀ—kxhy</w:t>
+            </w:r>
+            <w:r>
+              <w:rPr>
+                <w:rFonts w:ascii="BRH Malayalam Extra" w:hAnsi="BRH Malayalam Extra" w:cs="BRH Malayalam Extra"/>
+                <w:b/>
+                <w:color w:val="EE0000"/>
+                <w:sz w:val="32"/>
+                <w:szCs w:val="40"/>
+              </w:rPr>
+              <w:t>–</w:t>
+            </w:r>
+            <w:r>
+              <w:rPr>
+                <w:rFonts w:ascii="BRH Malayalam Extra" w:hAnsi="BRH Malayalam Extra" w:cs="BRH Malayalam Extra"/>
+                <w:color w:val="EE0000"/>
+                <w:sz w:val="40"/>
+                <w:szCs w:val="40"/>
+              </w:rPr>
+              <w:t xml:space="preserve">k¡e— | </w:t>
             </w:r>
           </w:p>
           <w:p>
@@ -1394,111 +1328,117 @@
               <w:autoSpaceDE w:val="0"/>
               <w:autoSpaceDN w:val="0"/>
               <w:adjustRightInd w:val="0"/>
-              <w:spacing w:line="252" w:lineRule="auto"/>
-              <w:rPr>
-                <w:rFonts w:ascii="BRH Malayalam Extra" w:hAnsi="BRH Malayalam Extra" w:cs="BRH Malayalam Extra"/>
-                <w:sz w:val="40"/>
-                <w:szCs w:val="40"/>
-              </w:rPr>
-            </w:pPr>
-            <w:r>
-              <w:rPr>
-                <w:rFonts w:ascii="BRH Malayalam Extra" w:hAnsi="BRH Malayalam Extra" w:cs="BRH Malayalam Extra"/>
-                <w:sz w:val="40"/>
-                <w:szCs w:val="40"/>
-              </w:rPr>
-              <w:t>i</w:t>
-            </w:r>
-            <w:r>
-              <w:rPr>
-                <w:rFonts w:ascii="BRH Malayalam Extra" w:hAnsi="BRH Malayalam Extra" w:cs="BRH Malayalam Extra"/>
-                <w:b/>
-                <w:sz w:val="32"/>
-                <w:szCs w:val="40"/>
-              </w:rPr>
-              <w:t>–</w:t>
-            </w:r>
-            <w:r>
-              <w:rPr>
-                <w:rFonts w:ascii="BRH Malayalam Extra" w:hAnsi="BRH Malayalam Extra" w:cs="BRH Malayalam Extra"/>
-                <w:sz w:val="40"/>
-                <w:szCs w:val="40"/>
-              </w:rPr>
-              <w:t>Np</w:t>
-            </w:r>
-            <w:r>
-              <w:rPr>
-                <w:rFonts w:ascii="BRH Malayalam Extra" w:hAnsi="BRH Malayalam Extra" w:cs="BRH Malayalam Extra"/>
-                <w:b/>
-                <w:sz w:val="32"/>
-                <w:szCs w:val="40"/>
-              </w:rPr>
-              <w:t>–</w:t>
-            </w:r>
-            <w:r>
-              <w:rPr>
-                <w:rFonts w:ascii="BRH Malayalam Extra" w:hAnsi="BRH Malayalam Extra" w:cs="BRH Malayalam Extra"/>
-                <w:sz w:val="40"/>
-                <w:szCs w:val="40"/>
-              </w:rPr>
-              <w:t xml:space="preserve">a§sûyZy— </w:t>
-            </w:r>
-          </w:p>
-          <w:p>
-            <w:pPr>
-              <w:widowControl w:val="0"/>
-              <w:autoSpaceDE w:val="0"/>
-              <w:autoSpaceDN w:val="0"/>
-              <w:adjustRightInd w:val="0"/>
-              <w:spacing w:line="252" w:lineRule="auto"/>
-              <w:ind w:right="-165"/>
-              <w:rPr>
-                <w:rFonts w:ascii="BRH Malayalam Extra" w:hAnsi="BRH Malayalam Extra" w:cs="BRH Malayalam Extra"/>
-                <w:sz w:val="40"/>
-                <w:szCs w:val="40"/>
-              </w:rPr>
-            </w:pPr>
-            <w:r>
-              <w:rPr>
-                <w:rFonts w:ascii="BRH Malayalam Extra" w:hAnsi="BRH Malayalam Extra" w:cs="BRH Malayalam Extra"/>
-                <w:sz w:val="40"/>
-                <w:szCs w:val="40"/>
-              </w:rPr>
-              <w:t>i</w:t>
-            </w:r>
-            <w:r>
-              <w:rPr>
-                <w:rFonts w:ascii="BRH Malayalam Extra" w:hAnsi="BRH Malayalam Extra" w:cs="BRH Malayalam Extra"/>
-                <w:b/>
-                <w:sz w:val="32"/>
-                <w:szCs w:val="40"/>
-              </w:rPr>
-              <w:t>–</w:t>
-            </w:r>
-            <w:r>
-              <w:rPr>
-                <w:rFonts w:ascii="BRH Malayalam Extra" w:hAnsi="BRH Malayalam Extra" w:cs="BRH Malayalam Extra"/>
-                <w:sz w:val="40"/>
-                <w:szCs w:val="40"/>
-              </w:rPr>
-              <w:t xml:space="preserve">Np—Z§ - </w:t>
-            </w:r>
-            <w:r>
-              <w:rPr>
-                <w:rFonts w:ascii="BRH Malayalam Extra" w:hAnsi="BRH Malayalam Extra" w:cs="BRH Malayalam Extra"/>
+              <w:spacing w:before="0" w:line="240" w:lineRule="auto"/>
+              <w:rPr>
+                <w:rFonts w:ascii="BRH Malayalam Extra" w:hAnsi="BRH Malayalam Extra" w:cs="BRH Malayalam Extra"/>
+                <w:color w:val="EE0000"/>
+                <w:sz w:val="40"/>
+                <w:szCs w:val="40"/>
+              </w:rPr>
+            </w:pPr>
+            <w:r>
+              <w:rPr>
+                <w:rFonts w:ascii="BRH Malayalam Extra" w:hAnsi="BRH Malayalam Extra" w:cs="BRH Malayalam Extra"/>
+                <w:color w:val="EE0000"/>
+                <w:sz w:val="40"/>
+                <w:szCs w:val="40"/>
+              </w:rPr>
+              <w:t>DÀ—kxhy</w:t>
+            </w:r>
+            <w:r>
+              <w:rPr>
+                <w:rFonts w:ascii="BRH Malayalam Extra" w:hAnsi="BRH Malayalam Extra" w:cs="BRH Malayalam Extra"/>
+                <w:b/>
+                <w:color w:val="EE0000"/>
+                <w:sz w:val="32"/>
+                <w:szCs w:val="40"/>
+              </w:rPr>
+              <w:t>–</w:t>
+            </w:r>
+            <w:r>
+              <w:rPr>
+                <w:rFonts w:ascii="BRH Malayalam Extra" w:hAnsi="BRH Malayalam Extra" w:cs="BRH Malayalam Extra"/>
+                <w:color w:val="EE0000"/>
+                <w:sz w:val="40"/>
+                <w:szCs w:val="40"/>
+              </w:rPr>
+              <w:t>ky</w:t>
+            </w:r>
+            <w:r>
+              <w:rPr>
+                <w:rFonts w:ascii="BRH Malayalam Extra" w:hAnsi="BRH Malayalam Extra" w:cs="BRH Malayalam Extra"/>
+                <w:color w:val="EE0000"/>
                 <w:sz w:val="40"/>
                 <w:szCs w:val="40"/>
                 <w:highlight w:val="yellow"/>
               </w:rPr>
-              <w:t>s¡</w:t>
-            </w:r>
-            <w:r>
-              <w:rPr>
-                <w:rFonts w:ascii="BRH Malayalam Extra" w:hAnsi="BRH Malayalam Extra" w:cs="BRH Malayalam Extra"/>
-                <w:sz w:val="40"/>
-                <w:szCs w:val="40"/>
-              </w:rPr>
-              <w:t xml:space="preserve"> |</w:t>
+              <w:t>Zõ</w:t>
+            </w:r>
+            <w:r>
+              <w:rPr>
+                <w:rFonts w:ascii="BRH Malayalam Extra" w:hAnsi="BRH Malayalam Extra" w:cs="BRH Malayalam Extra"/>
+                <w:color w:val="EE0000"/>
+                <w:sz w:val="40"/>
+                <w:szCs w:val="40"/>
+              </w:rPr>
+              <w:t>¡—Z§ - Z</w:t>
+            </w:r>
+            <w:r>
+              <w:rPr>
+                <w:rFonts w:ascii="BRH Malayalam Extra" w:hAnsi="BRH Malayalam Extra" w:cs="BRH Malayalam Extra"/>
+                <w:b/>
+                <w:color w:val="EE0000"/>
+                <w:sz w:val="32"/>
+                <w:szCs w:val="40"/>
+              </w:rPr>
+              <w:t>–</w:t>
+            </w:r>
+            <w:r>
+              <w:rPr>
+                <w:rFonts w:ascii="BRH Malayalam Extra" w:hAnsi="BRH Malayalam Extra" w:cs="BRH Malayalam Extra"/>
+                <w:color w:val="EE0000"/>
+                <w:sz w:val="40"/>
+                <w:szCs w:val="40"/>
+              </w:rPr>
+              <w:t>kx</w:t>
+            </w:r>
+            <w:r>
+              <w:rPr>
+                <w:rFonts w:ascii="BRH Malayalam Extra" w:hAnsi="BRH Malayalam Extra" w:cs="BRH Malayalam Extra"/>
+                <w:b/>
+                <w:color w:val="EE0000"/>
+                <w:sz w:val="32"/>
+                <w:szCs w:val="40"/>
+              </w:rPr>
+              <w:t>–</w:t>
+            </w:r>
+            <w:r>
+              <w:rPr>
+                <w:rFonts w:ascii="BRH Malayalam Extra" w:hAnsi="BRH Malayalam Extra" w:cs="BRH Malayalam Extra"/>
+                <w:color w:val="EE0000"/>
+                <w:sz w:val="40"/>
+                <w:szCs w:val="40"/>
+              </w:rPr>
+              <w:t>hy</w:t>
+            </w:r>
+            <w:r>
+              <w:rPr>
+                <w:rFonts w:ascii="BRH Malayalam Extra" w:hAnsi="BRH Malayalam Extra" w:cs="BRH Malayalam Extra"/>
+                <w:b/>
+                <w:color w:val="EE0000"/>
+                <w:sz w:val="32"/>
+                <w:szCs w:val="40"/>
+              </w:rPr>
+              <w:t>–</w:t>
+            </w:r>
+            <w:r>
+              <w:rPr>
+                <w:rFonts w:ascii="BRH Malayalam Extra" w:hAnsi="BRH Malayalam Extra" w:cs="BRH Malayalam Extra"/>
+                <w:color w:val="EE0000"/>
+                <w:sz w:val="40"/>
+                <w:szCs w:val="40"/>
+              </w:rPr>
+              <w:t>J |</w:t>
             </w:r>
           </w:p>
         </w:tc>
@@ -1518,56 +1458,282 @@
               <w:autoSpaceDE w:val="0"/>
               <w:autoSpaceDN w:val="0"/>
               <w:adjustRightInd w:val="0"/>
-              <w:spacing w:line="252" w:lineRule="auto"/>
-              <w:rPr>
-                <w:rFonts w:ascii="BRH Malayalam Extra" w:hAnsi="BRH Malayalam Extra" w:cs="BRH Malayalam Extra"/>
-                <w:sz w:val="40"/>
-                <w:szCs w:val="40"/>
-              </w:rPr>
-            </w:pPr>
-            <w:r>
-              <w:rPr>
-                <w:rFonts w:ascii="BRH Malayalam Extra" w:hAnsi="BRH Malayalam Extra" w:cs="BRH Malayalam Extra"/>
-                <w:sz w:val="40"/>
-                <w:szCs w:val="40"/>
-              </w:rPr>
-              <w:t>i</w:t>
-            </w:r>
-            <w:r>
-              <w:rPr>
-                <w:rFonts w:ascii="BRH Malayalam Extra" w:hAnsi="BRH Malayalam Extra" w:cs="BRH Malayalam Extra"/>
-                <w:b/>
-                <w:sz w:val="32"/>
-                <w:szCs w:val="40"/>
-              </w:rPr>
-              <w:t>–</w:t>
-            </w:r>
-            <w:r>
-              <w:rPr>
-                <w:rFonts w:ascii="BRH Malayalam Extra" w:hAnsi="BRH Malayalam Extra" w:cs="BRH Malayalam Extra"/>
-                <w:sz w:val="40"/>
-                <w:szCs w:val="40"/>
-              </w:rPr>
-              <w:t>Np—a§s¡ cx</w:t>
-            </w:r>
-            <w:r>
-              <w:rPr>
-                <w:rFonts w:ascii="BRH Malayalam Extra" w:hAnsi="BRH Malayalam Extra" w:cs="BRH Malayalam Extra"/>
+              <w:spacing w:before="0" w:line="240" w:lineRule="auto"/>
+              <w:rPr>
+                <w:rFonts w:ascii="BRH Malayalam Extra" w:hAnsi="BRH Malayalam Extra" w:cs="BRH Malayalam Extra"/>
+                <w:color w:val="EE0000"/>
+                <w:sz w:val="40"/>
+                <w:szCs w:val="40"/>
+              </w:rPr>
+            </w:pPr>
+            <w:r>
+              <w:rPr>
+                <w:rFonts w:ascii="BRH Malayalam Extra" w:hAnsi="BRH Malayalam Extra" w:cs="BRH Malayalam Extra"/>
+                <w:color w:val="EE0000"/>
+                <w:sz w:val="40"/>
+                <w:szCs w:val="40"/>
+              </w:rPr>
+              <w:t>DÀ—kxhy</w:t>
+            </w:r>
+            <w:r>
+              <w:rPr>
+                <w:rFonts w:ascii="BRH Malayalam Extra" w:hAnsi="BRH Malayalam Extra" w:cs="BRH Malayalam Extra"/>
+                <w:b/>
+                <w:color w:val="EE0000"/>
+                <w:sz w:val="32"/>
+                <w:szCs w:val="40"/>
+              </w:rPr>
+              <w:t>–</w:t>
+            </w:r>
+            <w:r>
+              <w:rPr>
+                <w:rFonts w:ascii="BRH Malayalam Extra" w:hAnsi="BRH Malayalam Extra" w:cs="BRH Malayalam Extra"/>
+                <w:color w:val="EE0000"/>
+                <w:sz w:val="40"/>
+                <w:szCs w:val="40"/>
+              </w:rPr>
+              <w:t xml:space="preserve">k¡e— | </w:t>
+            </w:r>
+          </w:p>
+          <w:p>
+            <w:pPr>
+              <w:widowControl w:val="0"/>
+              <w:autoSpaceDE w:val="0"/>
+              <w:autoSpaceDN w:val="0"/>
+              <w:adjustRightInd w:val="0"/>
+              <w:spacing w:before="0" w:line="240" w:lineRule="auto"/>
+              <w:rPr>
+                <w:rFonts w:ascii="BRH Malayalam Extra" w:hAnsi="BRH Malayalam Extra" w:cs="BRH Malayalam Extra"/>
+                <w:color w:val="EE0000"/>
+                <w:sz w:val="40"/>
+                <w:szCs w:val="40"/>
+              </w:rPr>
+            </w:pPr>
+            <w:r>
+              <w:rPr>
+                <w:rFonts w:ascii="BRH Malayalam Extra" w:hAnsi="BRH Malayalam Extra" w:cs="BRH Malayalam Extra"/>
+                <w:color w:val="EE0000"/>
+                <w:sz w:val="40"/>
+                <w:szCs w:val="40"/>
+              </w:rPr>
+              <w:t>DÀ—kxhy</w:t>
+            </w:r>
+            <w:r>
+              <w:rPr>
+                <w:rFonts w:ascii="BRH Malayalam Extra" w:hAnsi="BRH Malayalam Extra" w:cs="BRH Malayalam Extra"/>
+                <w:b/>
+                <w:color w:val="EE0000"/>
+                <w:sz w:val="32"/>
+                <w:szCs w:val="40"/>
+              </w:rPr>
+              <w:t>–</w:t>
+            </w:r>
+            <w:r>
+              <w:rPr>
+                <w:rFonts w:ascii="BRH Malayalam Extra" w:hAnsi="BRH Malayalam Extra" w:cs="BRH Malayalam Extra"/>
+                <w:color w:val="EE0000"/>
+                <w:sz w:val="40"/>
+                <w:szCs w:val="40"/>
+              </w:rPr>
+              <w:t>ky</w:t>
+            </w:r>
+            <w:r>
+              <w:rPr>
+                <w:rFonts w:ascii="BRH Malayalam Extra" w:hAnsi="BRH Malayalam Extra" w:cs="BRH Malayalam Extra"/>
+                <w:color w:val="EE0000"/>
                 <w:sz w:val="40"/>
                 <w:szCs w:val="40"/>
                 <w:highlight w:val="green"/>
               </w:rPr>
-              <w:t>k</w:t>
-            </w:r>
-            <w:r>
-              <w:rPr>
-                <w:rFonts w:ascii="BRH Malayalam Extra" w:hAnsi="BRH Malayalam Extra" w:cs="BRH Malayalam Extra"/>
-                <w:sz w:val="40"/>
-                <w:szCs w:val="40"/>
-              </w:rPr>
-              <w:t xml:space="preserve">j | </w:t>
-            </w:r>
-          </w:p>
+              <w:t>Zõ¡</w:t>
+            </w:r>
+            <w:r>
+              <w:rPr>
+                <w:rFonts w:ascii="BRH Malayalam Extra" w:hAnsi="BRH Malayalam Extra" w:cs="BRH Malayalam Extra"/>
+                <w:color w:val="EE0000"/>
+                <w:sz w:val="40"/>
+                <w:szCs w:val="40"/>
+              </w:rPr>
+              <w:t>Z§ - Z</w:t>
+            </w:r>
+            <w:r>
+              <w:rPr>
+                <w:rFonts w:ascii="BRH Malayalam Extra" w:hAnsi="BRH Malayalam Extra" w:cs="BRH Malayalam Extra"/>
+                <w:b/>
+                <w:color w:val="EE0000"/>
+                <w:sz w:val="32"/>
+                <w:szCs w:val="40"/>
+              </w:rPr>
+              <w:t>–</w:t>
+            </w:r>
+            <w:r>
+              <w:rPr>
+                <w:rFonts w:ascii="BRH Malayalam Extra" w:hAnsi="BRH Malayalam Extra" w:cs="BRH Malayalam Extra"/>
+                <w:color w:val="EE0000"/>
+                <w:sz w:val="40"/>
+                <w:szCs w:val="40"/>
+              </w:rPr>
+              <w:t>kx</w:t>
+            </w:r>
+            <w:r>
+              <w:rPr>
+                <w:rFonts w:ascii="BRH Malayalam Extra" w:hAnsi="BRH Malayalam Extra" w:cs="BRH Malayalam Extra"/>
+                <w:b/>
+                <w:color w:val="EE0000"/>
+                <w:sz w:val="32"/>
+                <w:szCs w:val="40"/>
+              </w:rPr>
+              <w:t>–</w:t>
+            </w:r>
+            <w:r>
+              <w:rPr>
+                <w:rFonts w:ascii="BRH Malayalam Extra" w:hAnsi="BRH Malayalam Extra" w:cs="BRH Malayalam Extra"/>
+                <w:color w:val="EE0000"/>
+                <w:sz w:val="40"/>
+                <w:szCs w:val="40"/>
+              </w:rPr>
+              <w:t>hy</w:t>
+            </w:r>
+            <w:r>
+              <w:rPr>
+                <w:rFonts w:ascii="BRH Malayalam Extra" w:hAnsi="BRH Malayalam Extra" w:cs="BRH Malayalam Extra"/>
+                <w:b/>
+                <w:color w:val="EE0000"/>
+                <w:sz w:val="32"/>
+                <w:szCs w:val="40"/>
+              </w:rPr>
+              <w:t>–</w:t>
+            </w:r>
+            <w:r>
+              <w:rPr>
+                <w:rFonts w:ascii="BRH Malayalam Extra" w:hAnsi="BRH Malayalam Extra" w:cs="BRH Malayalam Extra"/>
+                <w:color w:val="EE0000"/>
+                <w:sz w:val="40"/>
+                <w:szCs w:val="40"/>
+              </w:rPr>
+              <w:t>J |</w:t>
+            </w:r>
+          </w:p>
+        </w:tc>
+      </w:tr>
+      <w:tr>
+        <w:trPr>
+          <w:trHeight w:val="1105"/>
+        </w:trPr>
+        <w:tc>
+          <w:tcPr>
+            <w:tcW w:w="3764" w:type="dxa"/>
+            <w:tcBorders>
+              <w:top w:val="single" w:sz="4" w:space="0" w:color="000000"/>
+              <w:left w:val="single" w:sz="4" w:space="0" w:color="000000"/>
+              <w:bottom w:val="single" w:sz="4" w:space="0" w:color="000000"/>
+              <w:right w:val="single" w:sz="4" w:space="0" w:color="000000"/>
+            </w:tcBorders>
+          </w:tcPr>
+          <w:p>
+            <w:pPr>
+              <w:widowControl w:val="0"/>
+              <w:tabs>
+                <w:tab w:val="left" w:pos="993"/>
+              </w:tabs>
+              <w:autoSpaceDE w:val="0"/>
+              <w:autoSpaceDN w:val="0"/>
+              <w:adjustRightInd w:val="0"/>
+              <w:spacing w:before="0" w:line="240" w:lineRule="auto"/>
+              <w:rPr>
+                <w:rFonts w:eastAsia="Times New Roman" w:cs="Arial"/>
+                <w:b/>
+                <w:color w:val="EE0000"/>
+                <w:sz w:val="32"/>
+                <w:szCs w:val="32"/>
+                <w:lang w:val="en-IN" w:eastAsia="en-IN" w:bidi="ml-IN"/>
+              </w:rPr>
+            </w:pPr>
+            <w:r>
+              <w:rPr>
+                <w:rFonts w:eastAsia="Times New Roman" w:cs="Arial"/>
+                <w:b/>
+                <w:color w:val="EE0000"/>
+                <w:sz w:val="32"/>
+                <w:szCs w:val="32"/>
+                <w:lang w:val="en-IN" w:eastAsia="en-IN" w:bidi="ml-IN"/>
+              </w:rPr>
+              <w:t>T.S.1.5.9.2 - Kramam</w:t>
+            </w:r>
+          </w:p>
+          <w:p>
+            <w:pPr>
+              <w:widowControl w:val="0"/>
+              <w:tabs>
+                <w:tab w:val="left" w:pos="993"/>
+              </w:tabs>
+              <w:autoSpaceDE w:val="0"/>
+              <w:autoSpaceDN w:val="0"/>
+              <w:adjustRightInd w:val="0"/>
+              <w:spacing w:before="0" w:line="240" w:lineRule="auto"/>
+              <w:rPr>
+                <w:rFonts w:eastAsia="Times New Roman" w:cs="Arial"/>
+                <w:b/>
+                <w:color w:val="EE0000"/>
+                <w:sz w:val="32"/>
+                <w:szCs w:val="32"/>
+                <w:lang w:val="en-IN" w:eastAsia="en-IN" w:bidi="ml-IN"/>
+              </w:rPr>
+            </w:pPr>
+            <w:r>
+              <w:rPr>
+                <w:rFonts w:eastAsia="Times New Roman" w:cs="Arial"/>
+                <w:b/>
+                <w:color w:val="EE0000"/>
+                <w:sz w:val="32"/>
+                <w:szCs w:val="32"/>
+                <w:lang w:val="en-IN" w:eastAsia="en-IN" w:bidi="ml-IN"/>
+              </w:rPr>
+              <w:t>Krama Vaakyam No. 32</w:t>
+            </w:r>
+          </w:p>
+          <w:p>
+            <w:pPr>
+              <w:widowControl w:val="0"/>
+              <w:tabs>
+                <w:tab w:val="left" w:pos="993"/>
+              </w:tabs>
+              <w:autoSpaceDE w:val="0"/>
+              <w:autoSpaceDN w:val="0"/>
+              <w:adjustRightInd w:val="0"/>
+              <w:spacing w:before="0" w:line="240" w:lineRule="auto"/>
+              <w:rPr>
+                <w:rFonts w:eastAsia="Times New Roman" w:cs="Arial"/>
+                <w:b/>
+                <w:color w:val="EE0000"/>
+                <w:sz w:val="32"/>
+                <w:szCs w:val="32"/>
+                <w:lang w:val="it-IT" w:eastAsia="en-IN" w:bidi="ml-IN"/>
+              </w:rPr>
+            </w:pPr>
+            <w:r>
+              <w:rPr>
+                <w:rFonts w:eastAsia="Times New Roman" w:cs="Arial"/>
+                <w:b/>
+                <w:color w:val="EE0000"/>
+                <w:sz w:val="32"/>
+                <w:szCs w:val="32"/>
+                <w:lang w:val="it-IT" w:eastAsia="en-IN" w:bidi="ml-IN"/>
+              </w:rPr>
+              <w:t>Panchaati No. 37</w:t>
+            </w:r>
+          </w:p>
+        </w:tc>
+        <w:tc>
+          <w:tcPr>
+            <w:tcW w:w="5102" w:type="dxa"/>
+            <w:tcBorders>
+              <w:top w:val="single" w:sz="4" w:space="0" w:color="000000"/>
+              <w:left w:val="single" w:sz="4" w:space="0" w:color="000000"/>
+              <w:bottom w:val="single" w:sz="4" w:space="0" w:color="000000"/>
+              <w:right w:val="single" w:sz="4" w:space="0" w:color="000000"/>
+            </w:tcBorders>
+          </w:tcPr>
           <w:p>
             <w:pPr>
               <w:widowControl w:val="0"/>
@@ -1575,6 +1741,1550 @@
               <w:autoSpaceDN w:val="0"/>
               <w:adjustRightInd w:val="0"/>
               <w:spacing w:line="252" w:lineRule="auto"/>
+              <w:ind w:right="-165"/>
+              <w:rPr>
+                <w:rFonts w:ascii="BRH Malayalam Extra" w:hAnsi="BRH Malayalam Extra" w:cs="BRH Malayalam Extra"/>
+                <w:color w:val="EE0000"/>
+                <w:sz w:val="40"/>
+                <w:szCs w:val="40"/>
+                <w:lang w:val="it-IT"/>
+              </w:rPr>
+            </w:pPr>
+            <w:r>
+              <w:rPr>
+                <w:rFonts w:ascii="BRH Malayalam Extra" w:hAnsi="BRH Malayalam Extra" w:cs="BRH Malayalam Extra"/>
+                <w:color w:val="EE0000"/>
+                <w:sz w:val="40"/>
+                <w:szCs w:val="40"/>
+                <w:lang w:val="it-IT"/>
+              </w:rPr>
+              <w:t>qûJqû—J | qûJ¥</w:t>
+            </w:r>
+            <w:r>
+              <w:rPr>
+                <w:rFonts w:ascii="BRH Malayalam Extra" w:hAnsi="BRH Malayalam Extra" w:cs="BRH Malayalam Extra"/>
+                <w:color w:val="EE0000"/>
+                <w:sz w:val="40"/>
+                <w:szCs w:val="40"/>
+                <w:highlight w:val="yellow"/>
+                <w:lang w:val="it-IT"/>
+              </w:rPr>
+              <w:t>qûx</w:t>
+            </w:r>
+            <w:r>
+              <w:rPr>
+                <w:rFonts w:ascii="BRH Malayalam Extra" w:hAnsi="BRH Malayalam Extra" w:cs="BRH Malayalam Extra"/>
+                <w:color w:val="EE0000"/>
+                <w:sz w:val="40"/>
+                <w:szCs w:val="40"/>
+                <w:lang w:val="it-IT"/>
+              </w:rPr>
+              <w:t xml:space="preserve"> h¢jx©— |</w:t>
+            </w:r>
+          </w:p>
+        </w:tc>
+        <w:tc>
+          <w:tcPr>
+            <w:tcW w:w="5103" w:type="dxa"/>
+            <w:tcBorders>
+              <w:top w:val="single" w:sz="4" w:space="0" w:color="000000"/>
+              <w:left w:val="single" w:sz="4" w:space="0" w:color="000000"/>
+              <w:bottom w:val="single" w:sz="4" w:space="0" w:color="000000"/>
+              <w:right w:val="single" w:sz="4" w:space="0" w:color="000000"/>
+            </w:tcBorders>
+          </w:tcPr>
+          <w:p>
+            <w:pPr>
+              <w:autoSpaceDE w:val="0"/>
+              <w:autoSpaceDN w:val="0"/>
+              <w:adjustRightInd w:val="0"/>
+              <w:spacing w:before="0" w:line="240" w:lineRule="auto"/>
+              <w:rPr>
+                <w:rFonts w:ascii="BRH Malayalam Extra" w:hAnsi="BRH Malayalam Extra" w:cs="BRH Malayalam Extra"/>
+                <w:color w:val="EE0000"/>
+                <w:sz w:val="40"/>
+                <w:szCs w:val="40"/>
+                <w:lang w:val="it-IT"/>
+              </w:rPr>
+            </w:pPr>
+            <w:r>
+              <w:rPr>
+                <w:rFonts w:ascii="BRH Malayalam Extra" w:hAnsi="BRH Malayalam Extra" w:cs="BRH Malayalam Extra"/>
+                <w:color w:val="EE0000"/>
+                <w:sz w:val="40"/>
+                <w:szCs w:val="40"/>
+                <w:lang w:val="it-IT"/>
+              </w:rPr>
+              <w:t>qûJqû—J | qûJ¥</w:t>
+            </w:r>
+            <w:r>
+              <w:rPr>
+                <w:rFonts w:ascii="BRH Malayalam Extra" w:hAnsi="BRH Malayalam Extra" w:cs="BRH Malayalam Extra"/>
+                <w:color w:val="EE0000"/>
+                <w:sz w:val="40"/>
+                <w:szCs w:val="40"/>
+                <w:highlight w:val="green"/>
+                <w:lang w:val="it-IT"/>
+              </w:rPr>
+              <w:t>qûx</w:t>
+            </w:r>
+            <w:r>
+              <w:rPr>
+                <w:rFonts w:ascii="BRH Malayalam Extra" w:hAnsi="BRH Malayalam Extra" w:cs="BRH Malayalam Extra"/>
+                <w:b/>
+                <w:color w:val="EE0000"/>
+                <w:sz w:val="32"/>
+                <w:szCs w:val="40"/>
+                <w:highlight w:val="green"/>
+                <w:lang w:val="it-IT"/>
+              </w:rPr>
+              <w:t>–</w:t>
+            </w:r>
+            <w:r>
+              <w:rPr>
+                <w:rFonts w:ascii="BRH Malayalam Extra" w:hAnsi="BRH Malayalam Extra" w:cs="BRH Malayalam Extra"/>
+                <w:color w:val="EE0000"/>
+                <w:sz w:val="40"/>
+                <w:szCs w:val="40"/>
+                <w:lang w:val="it-IT"/>
+              </w:rPr>
+              <w:t xml:space="preserve"> h¢jx©— |</w:t>
+            </w:r>
+          </w:p>
+        </w:tc>
+      </w:tr>
+      <w:tr>
+        <w:trPr>
+          <w:trHeight w:val="1550"/>
+        </w:trPr>
+        <w:tc>
+          <w:tcPr>
+            <w:tcW w:w="3764" w:type="dxa"/>
+            <w:tcBorders>
+              <w:top w:val="single" w:sz="4" w:space="0" w:color="000000"/>
+              <w:left w:val="single" w:sz="4" w:space="0" w:color="000000"/>
+              <w:bottom w:val="single" w:sz="4" w:space="0" w:color="000000"/>
+              <w:right w:val="single" w:sz="4" w:space="0" w:color="000000"/>
+            </w:tcBorders>
+          </w:tcPr>
+          <w:p>
+            <w:pPr>
+              <w:widowControl w:val="0"/>
+              <w:tabs>
+                <w:tab w:val="left" w:pos="993"/>
+              </w:tabs>
+              <w:autoSpaceDE w:val="0"/>
+              <w:autoSpaceDN w:val="0"/>
+              <w:adjustRightInd w:val="0"/>
+              <w:spacing w:before="0" w:line="240" w:lineRule="auto"/>
+              <w:rPr>
+                <w:rFonts w:eastAsia="Times New Roman" w:cs="Arial"/>
+                <w:b/>
+                <w:color w:val="EE0000"/>
+                <w:sz w:val="32"/>
+                <w:szCs w:val="32"/>
+                <w:lang w:val="en-IN" w:eastAsia="en-IN" w:bidi="ml-IN"/>
+              </w:rPr>
+            </w:pPr>
+            <w:r>
+              <w:rPr>
+                <w:rFonts w:eastAsia="Times New Roman" w:cs="Arial"/>
+                <w:b/>
+                <w:color w:val="EE0000"/>
+                <w:sz w:val="32"/>
+                <w:szCs w:val="32"/>
+                <w:lang w:val="en-IN" w:eastAsia="en-IN" w:bidi="ml-IN"/>
+              </w:rPr>
+              <w:lastRenderedPageBreak/>
+              <w:t>T.S.1.5.9.</w:t>
+            </w:r>
+            <w:r>
+              <w:rPr>
+                <w:rFonts w:eastAsia="Times New Roman" w:cs="Arial"/>
+                <w:b/>
+                <w:color w:val="EE0000"/>
+                <w:sz w:val="32"/>
+                <w:szCs w:val="32"/>
+                <w:lang w:val="en-IN" w:eastAsia="en-IN" w:bidi="ml-IN"/>
+              </w:rPr>
+              <w:t>3</w:t>
+            </w:r>
+            <w:r>
+              <w:rPr>
+                <w:rFonts w:eastAsia="Times New Roman" w:cs="Arial"/>
+                <w:b/>
+                <w:color w:val="EE0000"/>
+                <w:sz w:val="32"/>
+                <w:szCs w:val="32"/>
+                <w:lang w:val="en-IN" w:eastAsia="en-IN" w:bidi="ml-IN"/>
+              </w:rPr>
+              <w:t xml:space="preserve"> - Kramam</w:t>
+            </w:r>
+          </w:p>
+          <w:p>
+            <w:pPr>
+              <w:widowControl w:val="0"/>
+              <w:tabs>
+                <w:tab w:val="left" w:pos="993"/>
+              </w:tabs>
+              <w:autoSpaceDE w:val="0"/>
+              <w:autoSpaceDN w:val="0"/>
+              <w:adjustRightInd w:val="0"/>
+              <w:spacing w:before="0" w:line="240" w:lineRule="auto"/>
+              <w:rPr>
+                <w:rFonts w:eastAsia="Times New Roman" w:cs="Arial"/>
+                <w:b/>
+                <w:color w:val="EE0000"/>
+                <w:sz w:val="28"/>
+                <w:szCs w:val="28"/>
+                <w:lang w:val="en-IN" w:eastAsia="en-IN" w:bidi="ml-IN"/>
+              </w:rPr>
+            </w:pPr>
+            <w:r>
+              <w:rPr>
+                <w:rFonts w:eastAsia="Times New Roman" w:cs="Arial"/>
+                <w:b/>
+                <w:color w:val="EE0000"/>
+                <w:sz w:val="28"/>
+                <w:szCs w:val="28"/>
+                <w:lang w:val="en-IN" w:eastAsia="en-IN" w:bidi="ml-IN"/>
+              </w:rPr>
+              <w:t>Krama Vaakyam No. 40,41</w:t>
+            </w:r>
+          </w:p>
+          <w:p>
+            <w:pPr>
+              <w:widowControl w:val="0"/>
+              <w:tabs>
+                <w:tab w:val="left" w:pos="993"/>
+              </w:tabs>
+              <w:autoSpaceDE w:val="0"/>
+              <w:autoSpaceDN w:val="0"/>
+              <w:adjustRightInd w:val="0"/>
+              <w:spacing w:before="0" w:line="240" w:lineRule="auto"/>
+              <w:rPr>
+                <w:rFonts w:eastAsia="Times New Roman" w:cs="Arial"/>
+                <w:b/>
+                <w:color w:val="EE0000"/>
+                <w:sz w:val="32"/>
+                <w:szCs w:val="32"/>
+                <w:lang w:val="it-IT" w:eastAsia="en-IN" w:bidi="ml-IN"/>
+              </w:rPr>
+            </w:pPr>
+            <w:r>
+              <w:rPr>
+                <w:rFonts w:eastAsia="Times New Roman" w:cs="Arial"/>
+                <w:b/>
+                <w:color w:val="EE0000"/>
+                <w:sz w:val="32"/>
+                <w:szCs w:val="32"/>
+                <w:lang w:val="it-IT" w:eastAsia="en-IN" w:bidi="ml-IN"/>
+              </w:rPr>
+              <w:t>Panchaati No. 38</w:t>
+            </w:r>
+          </w:p>
+        </w:tc>
+        <w:tc>
+          <w:tcPr>
+            <w:tcW w:w="5102" w:type="dxa"/>
+            <w:tcBorders>
+              <w:top w:val="single" w:sz="4" w:space="0" w:color="000000"/>
+              <w:left w:val="single" w:sz="4" w:space="0" w:color="000000"/>
+              <w:bottom w:val="single" w:sz="4" w:space="0" w:color="000000"/>
+              <w:right w:val="single" w:sz="4" w:space="0" w:color="000000"/>
+            </w:tcBorders>
+          </w:tcPr>
+          <w:p>
+            <w:pPr>
+              <w:widowControl w:val="0"/>
+              <w:autoSpaceDE w:val="0"/>
+              <w:autoSpaceDN w:val="0"/>
+              <w:adjustRightInd w:val="0"/>
+              <w:spacing w:before="0" w:line="240" w:lineRule="auto"/>
+              <w:ind w:right="-165"/>
+              <w:rPr>
+                <w:rFonts w:ascii="BRH Malayalam Extra" w:hAnsi="BRH Malayalam Extra" w:cs="BRH Malayalam Extra"/>
+                <w:color w:val="EE0000"/>
+                <w:sz w:val="40"/>
+                <w:szCs w:val="40"/>
+                <w:lang w:val="it-IT"/>
+              </w:rPr>
+            </w:pPr>
+            <w:r>
+              <w:rPr>
+                <w:rFonts w:ascii="BRH Malayalam Extra" w:hAnsi="BRH Malayalam Extra" w:cs="BRH Malayalam Extra"/>
+                <w:color w:val="EE0000"/>
+                <w:sz w:val="40"/>
+                <w:szCs w:val="40"/>
+                <w:lang w:val="it-IT"/>
+              </w:rPr>
+              <w:t>e</w:t>
+            </w:r>
+            <w:r>
+              <w:rPr>
+                <w:rFonts w:ascii="BRH Malayalam Extra" w:hAnsi="BRH Malayalam Extra" w:cs="BRH Malayalam Extra"/>
+                <w:b/>
+                <w:color w:val="EE0000"/>
+                <w:sz w:val="32"/>
+                <w:szCs w:val="40"/>
+                <w:lang w:val="it-IT"/>
+              </w:rPr>
+              <w:t>–</w:t>
+            </w:r>
+            <w:r>
+              <w:rPr>
+                <w:rFonts w:ascii="BRH Malayalam Extra" w:hAnsi="BRH Malayalam Extra" w:cs="BRH Malayalam Extra"/>
+                <w:color w:val="EE0000"/>
+                <w:sz w:val="40"/>
+                <w:szCs w:val="40"/>
+                <w:lang w:val="it-IT"/>
+              </w:rPr>
+              <w:t>q¢©. py</w:t>
+            </w:r>
+            <w:r>
+              <w:rPr>
+                <w:rFonts w:ascii="BRH Malayalam Extra" w:hAnsi="BRH Malayalam Extra" w:cs="BRH Malayalam Extra"/>
+                <w:b/>
+                <w:color w:val="EE0000"/>
+                <w:sz w:val="32"/>
+                <w:szCs w:val="40"/>
+                <w:lang w:val="it-IT"/>
+              </w:rPr>
+              <w:t>–</w:t>
+            </w:r>
+            <w:r>
+              <w:rPr>
+                <w:rFonts w:ascii="BRH Malayalam Extra" w:hAnsi="BRH Malayalam Extra" w:cs="BRH Malayalam Extra"/>
+                <w:color w:val="EE0000"/>
+                <w:sz w:val="40"/>
+                <w:szCs w:val="40"/>
+                <w:highlight w:val="yellow"/>
+                <w:lang w:val="it-IT"/>
+              </w:rPr>
+              <w:t>Z</w:t>
+            </w:r>
+            <w:r>
+              <w:rPr>
+                <w:rFonts w:ascii="BRH Malayalam Extra" w:hAnsi="BRH Malayalam Extra" w:cs="BRH Malayalam Extra"/>
+                <w:color w:val="EE0000"/>
+                <w:sz w:val="40"/>
+                <w:szCs w:val="40"/>
+                <w:lang w:val="it-IT"/>
+              </w:rPr>
+              <w:t xml:space="preserve">ûx | </w:t>
+            </w:r>
+          </w:p>
+          <w:p>
+            <w:pPr>
+              <w:widowControl w:val="0"/>
+              <w:autoSpaceDE w:val="0"/>
+              <w:autoSpaceDN w:val="0"/>
+              <w:adjustRightInd w:val="0"/>
+              <w:spacing w:before="0" w:line="240" w:lineRule="auto"/>
+              <w:ind w:right="-165"/>
+              <w:rPr>
+                <w:rFonts w:ascii="BRH Malayalam Extra" w:hAnsi="BRH Malayalam Extra" w:cs="BRH Malayalam Extra"/>
+                <w:color w:val="EE0000"/>
+                <w:sz w:val="40"/>
+                <w:szCs w:val="40"/>
+                <w:lang w:val="it-IT"/>
+              </w:rPr>
+            </w:pPr>
+            <w:r>
+              <w:rPr>
+                <w:rFonts w:ascii="BRH Malayalam Extra" w:hAnsi="BRH Malayalam Extra" w:cs="BRH Malayalam Extra"/>
+                <w:color w:val="EE0000"/>
+                <w:sz w:val="40"/>
+                <w:szCs w:val="40"/>
+                <w:lang w:val="it-IT"/>
+              </w:rPr>
+              <w:t>py</w:t>
+            </w:r>
+            <w:r>
+              <w:rPr>
+                <w:rFonts w:ascii="BRH Malayalam Extra" w:hAnsi="BRH Malayalam Extra" w:cs="BRH Malayalam Extra"/>
+                <w:b/>
+                <w:color w:val="EE0000"/>
+                <w:sz w:val="32"/>
+                <w:szCs w:val="40"/>
+                <w:lang w:val="it-IT"/>
+              </w:rPr>
+              <w:t>–</w:t>
+            </w:r>
+            <w:r>
+              <w:rPr>
+                <w:rFonts w:ascii="BRH Malayalam Extra" w:hAnsi="BRH Malayalam Extra" w:cs="BRH Malayalam Extra"/>
+                <w:color w:val="EE0000"/>
+                <w:sz w:val="40"/>
+                <w:szCs w:val="40"/>
+                <w:highlight w:val="yellow"/>
+                <w:lang w:val="it-IT"/>
+              </w:rPr>
+              <w:t>Z</w:t>
+            </w:r>
+            <w:r>
+              <w:rPr>
+                <w:rFonts w:ascii="BRH Malayalam Extra" w:hAnsi="BRH Malayalam Extra" w:cs="BRH Malayalam Extra"/>
+                <w:color w:val="EE0000"/>
+                <w:sz w:val="40"/>
+                <w:szCs w:val="40"/>
+                <w:lang w:val="it-IT"/>
+              </w:rPr>
+              <w:t>ûx Kxix©— |</w:t>
+            </w:r>
+          </w:p>
+        </w:tc>
+        <w:tc>
+          <w:tcPr>
+            <w:tcW w:w="5103" w:type="dxa"/>
+            <w:tcBorders>
+              <w:top w:val="single" w:sz="4" w:space="0" w:color="000000"/>
+              <w:left w:val="single" w:sz="4" w:space="0" w:color="000000"/>
+              <w:bottom w:val="single" w:sz="4" w:space="0" w:color="000000"/>
+              <w:right w:val="single" w:sz="4" w:space="0" w:color="000000"/>
+            </w:tcBorders>
+          </w:tcPr>
+          <w:p>
+            <w:pPr>
+              <w:autoSpaceDE w:val="0"/>
+              <w:autoSpaceDN w:val="0"/>
+              <w:adjustRightInd w:val="0"/>
+              <w:spacing w:before="0" w:line="240" w:lineRule="auto"/>
+              <w:rPr>
+                <w:rFonts w:ascii="BRH Malayalam Extra" w:hAnsi="BRH Malayalam Extra" w:cs="BRH Malayalam Extra"/>
+                <w:color w:val="EE0000"/>
+                <w:sz w:val="40"/>
+                <w:szCs w:val="40"/>
+                <w:lang w:val="it-IT"/>
+              </w:rPr>
+            </w:pPr>
+            <w:r>
+              <w:rPr>
+                <w:rFonts w:ascii="BRH Malayalam Extra" w:hAnsi="BRH Malayalam Extra" w:cs="BRH Malayalam Extra"/>
+                <w:color w:val="EE0000"/>
+                <w:sz w:val="40"/>
+                <w:szCs w:val="40"/>
+                <w:lang w:val="it-IT"/>
+              </w:rPr>
+              <w:t>e</w:t>
+            </w:r>
+            <w:r>
+              <w:rPr>
+                <w:rFonts w:ascii="BRH Malayalam Extra" w:hAnsi="BRH Malayalam Extra" w:cs="BRH Malayalam Extra"/>
+                <w:b/>
+                <w:color w:val="EE0000"/>
+                <w:sz w:val="32"/>
+                <w:szCs w:val="40"/>
+                <w:lang w:val="it-IT"/>
+              </w:rPr>
+              <w:t>–</w:t>
+            </w:r>
+            <w:r>
+              <w:rPr>
+                <w:rFonts w:ascii="BRH Malayalam Extra" w:hAnsi="BRH Malayalam Extra" w:cs="BRH Malayalam Extra"/>
+                <w:color w:val="EE0000"/>
+                <w:sz w:val="40"/>
+                <w:szCs w:val="40"/>
+                <w:lang w:val="it-IT"/>
+              </w:rPr>
+              <w:t>q¢©. py</w:t>
+            </w:r>
+            <w:r>
+              <w:rPr>
+                <w:rFonts w:ascii="BRH Malayalam Extra" w:hAnsi="BRH Malayalam Extra" w:cs="BRH Malayalam Extra"/>
+                <w:b/>
+                <w:color w:val="EE0000"/>
+                <w:sz w:val="32"/>
+                <w:szCs w:val="40"/>
+                <w:lang w:val="it-IT"/>
+              </w:rPr>
+              <w:t>–</w:t>
+            </w:r>
+            <w:r>
+              <w:rPr>
+                <w:rFonts w:ascii="BRH Malayalam Extra" w:hAnsi="BRH Malayalam Extra" w:cs="BRH Malayalam Extra"/>
+                <w:color w:val="EE0000"/>
+                <w:sz w:val="40"/>
+                <w:szCs w:val="40"/>
+                <w:highlight w:val="green"/>
+                <w:lang w:val="it-IT"/>
+              </w:rPr>
+              <w:t>À</w:t>
+            </w:r>
+            <w:r>
+              <w:rPr>
+                <w:rFonts w:ascii="BRH Malayalam Extra" w:hAnsi="BRH Malayalam Extra" w:cs="BRH Malayalam Extra"/>
+                <w:color w:val="EE0000"/>
+                <w:sz w:val="40"/>
+                <w:szCs w:val="40"/>
+                <w:lang w:val="it-IT"/>
+              </w:rPr>
+              <w:t xml:space="preserve">ûx | </w:t>
+            </w:r>
+          </w:p>
+          <w:p>
+            <w:pPr>
+              <w:autoSpaceDE w:val="0"/>
+              <w:autoSpaceDN w:val="0"/>
+              <w:adjustRightInd w:val="0"/>
+              <w:spacing w:before="0" w:line="240" w:lineRule="auto"/>
+              <w:rPr>
+                <w:rFonts w:ascii="BRH Malayalam Extra" w:hAnsi="BRH Malayalam Extra" w:cs="BRH Malayalam Extra"/>
+                <w:color w:val="EE0000"/>
+                <w:sz w:val="40"/>
+                <w:szCs w:val="40"/>
+                <w:lang w:val="it-IT"/>
+              </w:rPr>
+            </w:pPr>
+            <w:r>
+              <w:rPr>
+                <w:rFonts w:ascii="BRH Malayalam Extra" w:hAnsi="BRH Malayalam Extra" w:cs="BRH Malayalam Extra"/>
+                <w:color w:val="EE0000"/>
+                <w:sz w:val="40"/>
+                <w:szCs w:val="40"/>
+                <w:lang w:val="it-IT"/>
+              </w:rPr>
+              <w:t>py</w:t>
+            </w:r>
+            <w:r>
+              <w:rPr>
+                <w:rFonts w:ascii="BRH Malayalam Extra" w:hAnsi="BRH Malayalam Extra" w:cs="BRH Malayalam Extra"/>
+                <w:b/>
+                <w:color w:val="EE0000"/>
+                <w:sz w:val="32"/>
+                <w:szCs w:val="40"/>
+                <w:lang w:val="it-IT"/>
+              </w:rPr>
+              <w:t>–</w:t>
+            </w:r>
+            <w:r>
+              <w:rPr>
+                <w:rFonts w:ascii="BRH Malayalam Extra" w:hAnsi="BRH Malayalam Extra" w:cs="BRH Malayalam Extra"/>
+                <w:color w:val="EE0000"/>
+                <w:sz w:val="40"/>
+                <w:szCs w:val="40"/>
+                <w:highlight w:val="green"/>
+                <w:lang w:val="it-IT"/>
+              </w:rPr>
+              <w:t>À</w:t>
+            </w:r>
+            <w:r>
+              <w:rPr>
+                <w:rFonts w:ascii="BRH Malayalam Extra" w:hAnsi="BRH Malayalam Extra" w:cs="BRH Malayalam Extra"/>
+                <w:color w:val="EE0000"/>
+                <w:sz w:val="40"/>
+                <w:szCs w:val="40"/>
+                <w:lang w:val="it-IT"/>
+              </w:rPr>
+              <w:t>ûx Kxix©— |</w:t>
+            </w:r>
+            <w:r>
+              <w:rPr>
+                <w:rFonts w:ascii="BRH Malayalam Extra" w:hAnsi="BRH Malayalam Extra" w:cs="BRH Malayalam Extra"/>
+                <w:color w:val="EE0000"/>
+                <w:sz w:val="40"/>
+                <w:szCs w:val="40"/>
+                <w:lang w:val="it-IT"/>
+              </w:rPr>
+              <w:t xml:space="preserve"> </w:t>
+            </w:r>
+            <w:r>
+              <w:rPr>
+                <w:rFonts w:ascii="BRH Devanagari Extra" w:hAnsi="BRH Devanagari Extra" w:cs="BRH Devanagari Extra"/>
+                <w:color w:val="EE0000"/>
+                <w:sz w:val="40"/>
+                <w:szCs w:val="40"/>
+                <w:lang w:val="it-IT"/>
+              </w:rPr>
+              <w:t>(</w:t>
+            </w:r>
+            <w:r>
+              <w:rPr>
+                <w:rFonts w:cs="Arial"/>
+                <w:color w:val="EE0000"/>
+                <w:sz w:val="36"/>
+                <w:szCs w:val="36"/>
+                <w:lang w:val="it-IT"/>
+              </w:rPr>
+              <w:t>ttvA</w:t>
+            </w:r>
+            <w:r>
+              <w:rPr>
+                <w:rFonts w:ascii="BRH Devanagari Extra" w:hAnsi="BRH Devanagari Extra" w:cs="BRH Devanagari Extra"/>
+                <w:color w:val="EE0000"/>
+                <w:sz w:val="40"/>
+                <w:szCs w:val="40"/>
+                <w:lang w:val="it-IT"/>
+              </w:rPr>
+              <w:t>)</w:t>
+            </w:r>
+          </w:p>
+        </w:tc>
+      </w:tr>
+      <w:tr>
+        <w:trPr>
+          <w:trHeight w:val="1401"/>
+        </w:trPr>
+        <w:tc>
+          <w:tcPr>
+            <w:tcW w:w="3764" w:type="dxa"/>
+            <w:tcBorders>
+              <w:top w:val="single" w:sz="4" w:space="0" w:color="000000"/>
+              <w:left w:val="single" w:sz="4" w:space="0" w:color="000000"/>
+              <w:bottom w:val="single" w:sz="4" w:space="0" w:color="000000"/>
+              <w:right w:val="single" w:sz="4" w:space="0" w:color="000000"/>
+            </w:tcBorders>
+          </w:tcPr>
+          <w:p>
+            <w:pPr>
+              <w:widowControl w:val="0"/>
+              <w:tabs>
+                <w:tab w:val="left" w:pos="993"/>
+              </w:tabs>
+              <w:autoSpaceDE w:val="0"/>
+              <w:autoSpaceDN w:val="0"/>
+              <w:adjustRightInd w:val="0"/>
+              <w:spacing w:before="0" w:line="240" w:lineRule="auto"/>
+              <w:rPr>
+                <w:rFonts w:eastAsia="Times New Roman" w:cs="Arial"/>
+                <w:b/>
+                <w:color w:val="EE0000"/>
+                <w:sz w:val="32"/>
+                <w:szCs w:val="32"/>
+                <w:lang w:val="en-IN" w:eastAsia="en-IN" w:bidi="ml-IN"/>
+              </w:rPr>
+            </w:pPr>
+            <w:r>
+              <w:rPr>
+                <w:rFonts w:eastAsia="Times New Roman" w:cs="Arial"/>
+                <w:b/>
+                <w:color w:val="EE0000"/>
+                <w:sz w:val="32"/>
+                <w:szCs w:val="32"/>
+                <w:lang w:val="en-IN" w:eastAsia="en-IN" w:bidi="ml-IN"/>
+              </w:rPr>
+              <w:t>T.S.1.5.9.</w:t>
+            </w:r>
+            <w:r>
+              <w:rPr>
+                <w:rFonts w:eastAsia="Times New Roman" w:cs="Arial"/>
+                <w:b/>
+                <w:color w:val="EE0000"/>
+                <w:sz w:val="32"/>
+                <w:szCs w:val="32"/>
+                <w:lang w:val="en-IN" w:eastAsia="en-IN" w:bidi="ml-IN"/>
+              </w:rPr>
+              <w:t>4</w:t>
+            </w:r>
+            <w:r>
+              <w:rPr>
+                <w:rFonts w:eastAsia="Times New Roman" w:cs="Arial"/>
+                <w:b/>
+                <w:color w:val="EE0000"/>
+                <w:sz w:val="32"/>
+                <w:szCs w:val="32"/>
+                <w:lang w:val="en-IN" w:eastAsia="en-IN" w:bidi="ml-IN"/>
+              </w:rPr>
+              <w:t xml:space="preserve"> - Kramam</w:t>
+            </w:r>
+          </w:p>
+          <w:p>
+            <w:pPr>
+              <w:widowControl w:val="0"/>
+              <w:tabs>
+                <w:tab w:val="left" w:pos="993"/>
+              </w:tabs>
+              <w:autoSpaceDE w:val="0"/>
+              <w:autoSpaceDN w:val="0"/>
+              <w:adjustRightInd w:val="0"/>
+              <w:spacing w:before="0" w:line="240" w:lineRule="auto"/>
+              <w:rPr>
+                <w:rFonts w:eastAsia="Times New Roman" w:cs="Arial"/>
+                <w:b/>
+                <w:color w:val="EE0000"/>
+                <w:sz w:val="28"/>
+                <w:szCs w:val="28"/>
+                <w:lang w:val="it-IT" w:eastAsia="en-IN" w:bidi="ml-IN"/>
+              </w:rPr>
+            </w:pPr>
+            <w:r>
+              <w:rPr>
+                <w:rFonts w:eastAsia="Times New Roman" w:cs="Arial"/>
+                <w:b/>
+                <w:color w:val="EE0000"/>
+                <w:sz w:val="28"/>
+                <w:szCs w:val="28"/>
+                <w:lang w:val="it-IT" w:eastAsia="en-IN" w:bidi="ml-IN"/>
+              </w:rPr>
+              <w:t xml:space="preserve">Krama Vaakyam No. </w:t>
+            </w:r>
+            <w:r>
+              <w:rPr>
+                <w:rFonts w:eastAsia="Times New Roman" w:cs="Arial"/>
+                <w:b/>
+                <w:color w:val="EE0000"/>
+                <w:sz w:val="28"/>
+                <w:szCs w:val="28"/>
+                <w:lang w:val="it-IT" w:eastAsia="en-IN" w:bidi="ml-IN"/>
+              </w:rPr>
+              <w:t>22</w:t>
+            </w:r>
+            <w:r>
+              <w:rPr>
+                <w:rFonts w:eastAsia="Times New Roman" w:cs="Arial"/>
+                <w:b/>
+                <w:color w:val="EE0000"/>
+                <w:sz w:val="28"/>
+                <w:szCs w:val="28"/>
+                <w:lang w:val="it-IT" w:eastAsia="en-IN" w:bidi="ml-IN"/>
+              </w:rPr>
+              <w:t>,</w:t>
+            </w:r>
+            <w:r>
+              <w:rPr>
+                <w:rFonts w:eastAsia="Times New Roman" w:cs="Arial"/>
+                <w:b/>
+                <w:color w:val="EE0000"/>
+                <w:sz w:val="28"/>
+                <w:szCs w:val="28"/>
+                <w:lang w:val="it-IT" w:eastAsia="en-IN" w:bidi="ml-IN"/>
+              </w:rPr>
+              <w:t>23</w:t>
+            </w:r>
+          </w:p>
+          <w:p>
+            <w:pPr>
+              <w:widowControl w:val="0"/>
+              <w:tabs>
+                <w:tab w:val="left" w:pos="993"/>
+              </w:tabs>
+              <w:autoSpaceDE w:val="0"/>
+              <w:autoSpaceDN w:val="0"/>
+              <w:adjustRightInd w:val="0"/>
+              <w:spacing w:before="0" w:line="240" w:lineRule="auto"/>
+              <w:rPr>
+                <w:rFonts w:eastAsia="Times New Roman" w:cs="Arial"/>
+                <w:b/>
+                <w:color w:val="EE0000"/>
+                <w:sz w:val="32"/>
+                <w:szCs w:val="32"/>
+                <w:lang w:val="it-IT" w:eastAsia="en-IN" w:bidi="ml-IN"/>
+              </w:rPr>
+            </w:pPr>
+            <w:r>
+              <w:rPr>
+                <w:rFonts w:eastAsia="Times New Roman" w:cs="Arial"/>
+                <w:b/>
+                <w:color w:val="EE0000"/>
+                <w:sz w:val="32"/>
+                <w:szCs w:val="32"/>
+                <w:lang w:val="it-IT" w:eastAsia="en-IN" w:bidi="ml-IN"/>
+              </w:rPr>
+              <w:t>Panchaati No. 3</w:t>
+            </w:r>
+            <w:r>
+              <w:rPr>
+                <w:rFonts w:eastAsia="Times New Roman" w:cs="Arial"/>
+                <w:b/>
+                <w:color w:val="EE0000"/>
+                <w:sz w:val="32"/>
+                <w:szCs w:val="32"/>
+                <w:lang w:val="it-IT" w:eastAsia="en-IN" w:bidi="ml-IN"/>
+              </w:rPr>
+              <w:t>9</w:t>
+            </w:r>
+          </w:p>
+        </w:tc>
+        <w:tc>
+          <w:tcPr>
+            <w:tcW w:w="5102" w:type="dxa"/>
+            <w:tcBorders>
+              <w:top w:val="single" w:sz="4" w:space="0" w:color="000000"/>
+              <w:left w:val="single" w:sz="4" w:space="0" w:color="000000"/>
+              <w:bottom w:val="single" w:sz="4" w:space="0" w:color="000000"/>
+              <w:right w:val="single" w:sz="4" w:space="0" w:color="000000"/>
+            </w:tcBorders>
+          </w:tcPr>
+          <w:p>
+            <w:pPr>
+              <w:widowControl w:val="0"/>
+              <w:autoSpaceDE w:val="0"/>
+              <w:autoSpaceDN w:val="0"/>
+              <w:adjustRightInd w:val="0"/>
+              <w:spacing w:before="0" w:line="240" w:lineRule="auto"/>
+              <w:ind w:right="-165"/>
+              <w:rPr>
+                <w:rFonts w:ascii="BRH Malayalam Extra" w:hAnsi="BRH Malayalam Extra" w:cs="BRH Malayalam Extra"/>
+                <w:color w:val="EE0000"/>
+                <w:sz w:val="40"/>
+                <w:szCs w:val="40"/>
+                <w:lang w:val="en-IN"/>
+              </w:rPr>
+            </w:pPr>
+            <w:r>
+              <w:rPr>
+                <w:rFonts w:ascii="BRH Malayalam Extra" w:hAnsi="BRH Malayalam Extra" w:cs="BRH Malayalam Extra"/>
+                <w:color w:val="EE0000"/>
+                <w:sz w:val="40"/>
+                <w:szCs w:val="40"/>
+              </w:rPr>
+              <w:t>i£</w:t>
+            </w:r>
+            <w:r>
+              <w:rPr>
+                <w:rFonts w:ascii="BRH Malayalam Extra" w:hAnsi="BRH Malayalam Extra" w:cs="BRH Malayalam Extra"/>
+                <w:b/>
+                <w:color w:val="EE0000"/>
+                <w:sz w:val="32"/>
+                <w:szCs w:val="40"/>
+              </w:rPr>
+              <w:t>–</w:t>
+            </w:r>
+            <w:r>
+              <w:rPr>
+                <w:rFonts w:ascii="BRH Malayalam Extra" w:hAnsi="BRH Malayalam Extra" w:cs="BRH Malayalam Extra"/>
+                <w:color w:val="EE0000"/>
+                <w:sz w:val="40"/>
+                <w:szCs w:val="40"/>
+              </w:rPr>
+              <w:t>¥Zõxk</w:t>
+            </w:r>
+            <w:r>
+              <w:rPr>
+                <w:rFonts w:ascii="BRH Malayalam Extra" w:hAnsi="BRH Malayalam Extra" w:cs="BRH Malayalam Extra"/>
+                <w:color w:val="EE0000"/>
+                <w:sz w:val="40"/>
+                <w:szCs w:val="40"/>
+                <w:highlight w:val="yellow"/>
+              </w:rPr>
+              <w:t>—hy¥</w:t>
+            </w:r>
+            <w:r>
+              <w:rPr>
+                <w:rFonts w:ascii="BRH Malayalam" w:hAnsi="BRH Malayalam" w:cs="BRH Malayalam"/>
+                <w:color w:val="EE0000"/>
+                <w:sz w:val="40"/>
+                <w:szCs w:val="40"/>
+                <w:highlight w:val="yellow"/>
+                <w:lang w:val="en-IN" w:eastAsia="en-IN"/>
+              </w:rPr>
+              <w:t>g</w:t>
+            </w:r>
+            <w:r>
+              <w:rPr>
+                <w:rFonts w:ascii="BRH Malayalam Extra" w:hAnsi="BRH Malayalam Extra" w:cs="BRH Malayalam Extra"/>
+                <w:color w:val="EE0000"/>
+                <w:sz w:val="40"/>
+                <w:szCs w:val="40"/>
+              </w:rPr>
+              <w:t>Z§ | A</w:t>
+            </w:r>
+            <w:r>
+              <w:rPr>
+                <w:rFonts w:ascii="BRH Malayalam Extra" w:hAnsi="BRH Malayalam Extra" w:cs="BRH Malayalam Extra"/>
+                <w:b/>
+                <w:color w:val="EE0000"/>
+                <w:sz w:val="32"/>
+                <w:szCs w:val="40"/>
+                <w:highlight w:val="yellow"/>
+              </w:rPr>
+              <w:t>–</w:t>
+            </w:r>
+            <w:r>
+              <w:rPr>
+                <w:rFonts w:ascii="BRH Malayalam Extra" w:hAnsi="BRH Malayalam Extra" w:cs="BRH Malayalam Extra"/>
+                <w:color w:val="EE0000"/>
+                <w:sz w:val="40"/>
+                <w:szCs w:val="40"/>
+                <w:highlight w:val="yellow"/>
+              </w:rPr>
+              <w:t>hy</w:t>
+            </w:r>
+            <w:r>
+              <w:rPr>
+                <w:rFonts w:ascii="BRH Malayalam Extra" w:hAnsi="BRH Malayalam Extra" w:cs="BRH Malayalam Extra"/>
+                <w:b/>
+                <w:color w:val="EE0000"/>
+                <w:sz w:val="32"/>
+                <w:szCs w:val="40"/>
+                <w:highlight w:val="yellow"/>
+              </w:rPr>
+              <w:t>–</w:t>
+            </w:r>
+            <w:r>
+              <w:rPr>
+                <w:rFonts w:ascii="BRH Malayalam Extra" w:hAnsi="BRH Malayalam Extra" w:cs="BRH Malayalam Extra"/>
+                <w:color w:val="EE0000"/>
+                <w:sz w:val="40"/>
+                <w:szCs w:val="40"/>
+                <w:highlight w:val="yellow"/>
+              </w:rPr>
+              <w:t>¥</w:t>
+            </w:r>
+            <w:r>
+              <w:rPr>
+                <w:rFonts w:ascii="BRH Malayalam" w:hAnsi="BRH Malayalam" w:cs="BRH Malayalam"/>
+                <w:color w:val="EE0000"/>
+                <w:sz w:val="40"/>
+                <w:szCs w:val="40"/>
+                <w:highlight w:val="yellow"/>
+                <w:lang w:val="en-IN" w:eastAsia="en-IN"/>
+              </w:rPr>
+              <w:t>g</w:t>
+            </w:r>
+            <w:r>
+              <w:rPr>
+                <w:rFonts w:ascii="BRH Malayalam Extra" w:hAnsi="BRH Malayalam Extra" w:cs="BRH Malayalam Extra"/>
+                <w:b/>
+                <w:color w:val="EE0000"/>
+                <w:sz w:val="32"/>
+                <w:szCs w:val="40"/>
+              </w:rPr>
+              <w:t>–</w:t>
+            </w:r>
+            <w:r>
+              <w:rPr>
+                <w:rFonts w:ascii="BRH Malayalam Extra" w:hAnsi="BRH Malayalam Extra" w:cs="BRH Malayalam Extra"/>
+                <w:color w:val="EE0000"/>
+                <w:sz w:val="40"/>
+                <w:szCs w:val="40"/>
+              </w:rPr>
+              <w:t>© i£</w:t>
+            </w:r>
+            <w:r>
+              <w:rPr>
+                <w:rFonts w:ascii="BRH Malayalam Extra" w:hAnsi="BRH Malayalam Extra" w:cs="BRH Malayalam Extra"/>
+                <w:b/>
+                <w:color w:val="EE0000"/>
+                <w:sz w:val="32"/>
+                <w:szCs w:val="40"/>
+              </w:rPr>
+              <w:t>–</w:t>
+            </w:r>
+            <w:r>
+              <w:rPr>
+                <w:rFonts w:ascii="BRH Malayalam Extra" w:hAnsi="BRH Malayalam Extra" w:cs="BRH Malayalam Extra"/>
+                <w:color w:val="EE0000"/>
+                <w:sz w:val="40"/>
+                <w:szCs w:val="40"/>
+              </w:rPr>
+              <w:t>Zõ¡s—I</w:t>
+            </w:r>
+            <w:r>
+              <w:rPr>
+                <w:rFonts w:ascii="BRH Devanagari Extra" w:hAnsi="BRH Devanagari Extra" w:cs="BRH Malayalam Extra"/>
+                <w:color w:val="EE0000"/>
+                <w:sz w:val="32"/>
+                <w:szCs w:val="40"/>
+              </w:rPr>
+              <w:t>Æ</w:t>
+            </w:r>
+            <w:r>
+              <w:rPr>
+                <w:rFonts w:ascii="BRH Malayalam Extra" w:hAnsi="BRH Malayalam Extra" w:cs="BRH Malayalam Extra"/>
+                <w:color w:val="EE0000"/>
+                <w:sz w:val="40"/>
+                <w:szCs w:val="40"/>
+              </w:rPr>
+              <w:t>j¡ZJ |</w:t>
+            </w:r>
+          </w:p>
+        </w:tc>
+        <w:tc>
+          <w:tcPr>
+            <w:tcW w:w="5103" w:type="dxa"/>
+            <w:tcBorders>
+              <w:top w:val="single" w:sz="4" w:space="0" w:color="000000"/>
+              <w:left w:val="single" w:sz="4" w:space="0" w:color="000000"/>
+              <w:bottom w:val="single" w:sz="4" w:space="0" w:color="000000"/>
+              <w:right w:val="single" w:sz="4" w:space="0" w:color="000000"/>
+            </w:tcBorders>
+          </w:tcPr>
+          <w:p>
+            <w:pPr>
+              <w:autoSpaceDE w:val="0"/>
+              <w:autoSpaceDN w:val="0"/>
+              <w:adjustRightInd w:val="0"/>
+              <w:spacing w:before="0" w:line="240" w:lineRule="auto"/>
+              <w:rPr>
+                <w:rFonts w:ascii="BRH Malayalam Extra" w:hAnsi="BRH Malayalam Extra" w:cs="BRH Malayalam Extra"/>
+                <w:color w:val="EE0000"/>
+                <w:sz w:val="40"/>
+                <w:szCs w:val="40"/>
+                <w:lang w:val="en-IN"/>
+              </w:rPr>
+            </w:pPr>
+            <w:r>
+              <w:rPr>
+                <w:rFonts w:ascii="BRH Malayalam Extra" w:hAnsi="BRH Malayalam Extra" w:cs="BRH Malayalam Extra"/>
+                <w:color w:val="EE0000"/>
+                <w:sz w:val="40"/>
+                <w:szCs w:val="40"/>
+              </w:rPr>
+              <w:t>i£</w:t>
+            </w:r>
+            <w:r>
+              <w:rPr>
+                <w:rFonts w:ascii="BRH Malayalam Extra" w:hAnsi="BRH Malayalam Extra" w:cs="BRH Malayalam Extra"/>
+                <w:b/>
+                <w:color w:val="EE0000"/>
+                <w:sz w:val="32"/>
+                <w:szCs w:val="40"/>
+              </w:rPr>
+              <w:t>–</w:t>
+            </w:r>
+            <w:r>
+              <w:rPr>
+                <w:rFonts w:ascii="BRH Malayalam Extra" w:hAnsi="BRH Malayalam Extra" w:cs="BRH Malayalam Extra"/>
+                <w:color w:val="EE0000"/>
+                <w:sz w:val="40"/>
+                <w:szCs w:val="40"/>
+              </w:rPr>
+              <w:t>¥Zõxk</w:t>
+            </w:r>
+            <w:r>
+              <w:rPr>
+                <w:rFonts w:ascii="BRH Malayalam Extra" w:hAnsi="BRH Malayalam Extra" w:cs="BRH Malayalam Extra"/>
+                <w:color w:val="EE0000"/>
+                <w:sz w:val="40"/>
+                <w:szCs w:val="40"/>
+                <w:highlight w:val="green"/>
+              </w:rPr>
+              <w:t>—</w:t>
+            </w:r>
+            <w:r>
+              <w:rPr>
+                <w:rFonts w:ascii="BRH Malayalam" w:hAnsi="BRH Malayalam" w:cs="BRH Malayalam"/>
+                <w:color w:val="EE0000"/>
+                <w:sz w:val="40"/>
+                <w:szCs w:val="40"/>
+                <w:highlight w:val="green"/>
+                <w:lang w:val="en-IN" w:eastAsia="en-IN"/>
+              </w:rPr>
+              <w:t>g</w:t>
+            </w:r>
+            <w:r>
+              <w:rPr>
+                <w:rFonts w:ascii="BRH Malayalam Extra" w:hAnsi="BRH Malayalam Extra" w:cs="BRH Malayalam Extra"/>
+                <w:color w:val="EE0000"/>
+                <w:sz w:val="40"/>
+                <w:szCs w:val="40"/>
+                <w:highlight w:val="green"/>
+              </w:rPr>
+              <w:t>y¥h</w:t>
+            </w:r>
+            <w:r>
+              <w:rPr>
+                <w:rFonts w:ascii="BRH Malayalam Extra" w:hAnsi="BRH Malayalam Extra" w:cs="BRH Malayalam Extra"/>
+                <w:color w:val="EE0000"/>
+                <w:sz w:val="40"/>
+                <w:szCs w:val="40"/>
+              </w:rPr>
+              <w:t>Z§ | A</w:t>
+            </w:r>
+            <w:r>
+              <w:rPr>
+                <w:rFonts w:ascii="BRH Malayalam Extra" w:hAnsi="BRH Malayalam Extra" w:cs="BRH Malayalam Extra"/>
+                <w:b/>
+                <w:color w:val="EE0000"/>
+                <w:sz w:val="32"/>
+                <w:szCs w:val="40"/>
+              </w:rPr>
+              <w:t>–</w:t>
+            </w:r>
+            <w:r>
+              <w:rPr>
+                <w:rFonts w:ascii="BRH Malayalam" w:hAnsi="BRH Malayalam" w:cs="BRH Malayalam"/>
+                <w:color w:val="EE0000"/>
+                <w:sz w:val="40"/>
+                <w:szCs w:val="40"/>
+                <w:highlight w:val="green"/>
+                <w:lang w:val="en-IN" w:eastAsia="en-IN"/>
+              </w:rPr>
+              <w:t>g</w:t>
+            </w:r>
+            <w:r>
+              <w:rPr>
+                <w:rFonts w:ascii="BRH Malayalam Extra" w:hAnsi="BRH Malayalam Extra" w:cs="BRH Malayalam Extra"/>
+                <w:color w:val="EE0000"/>
+                <w:sz w:val="40"/>
+                <w:szCs w:val="40"/>
+                <w:highlight w:val="green"/>
+              </w:rPr>
+              <w:t>y</w:t>
+            </w:r>
+            <w:r>
+              <w:rPr>
+                <w:rFonts w:ascii="BRH Malayalam Extra" w:hAnsi="BRH Malayalam Extra" w:cs="BRH Malayalam Extra"/>
+                <w:b/>
+                <w:color w:val="EE0000"/>
+                <w:sz w:val="32"/>
+                <w:szCs w:val="40"/>
+                <w:highlight w:val="green"/>
+              </w:rPr>
+              <w:t>–</w:t>
+            </w:r>
+            <w:r>
+              <w:rPr>
+                <w:rFonts w:ascii="BRH Malayalam Extra" w:hAnsi="BRH Malayalam Extra" w:cs="BRH Malayalam Extra"/>
+                <w:color w:val="EE0000"/>
+                <w:sz w:val="40"/>
+                <w:szCs w:val="40"/>
+                <w:highlight w:val="green"/>
+              </w:rPr>
+              <w:t>¥h</w:t>
+            </w:r>
+            <w:r>
+              <w:rPr>
+                <w:rFonts w:ascii="BRH Malayalam Extra" w:hAnsi="BRH Malayalam Extra" w:cs="BRH Malayalam Extra"/>
+                <w:b/>
+                <w:color w:val="EE0000"/>
+                <w:sz w:val="32"/>
+                <w:szCs w:val="40"/>
+              </w:rPr>
+              <w:t>–</w:t>
+            </w:r>
+            <w:r>
+              <w:rPr>
+                <w:rFonts w:ascii="BRH Malayalam Extra" w:hAnsi="BRH Malayalam Extra" w:cs="BRH Malayalam Extra"/>
+                <w:color w:val="EE0000"/>
+                <w:sz w:val="40"/>
+                <w:szCs w:val="40"/>
+              </w:rPr>
+              <w:t>© i£</w:t>
+            </w:r>
+            <w:r>
+              <w:rPr>
+                <w:rFonts w:ascii="BRH Malayalam Extra" w:hAnsi="BRH Malayalam Extra" w:cs="BRH Malayalam Extra"/>
+                <w:b/>
+                <w:color w:val="EE0000"/>
+                <w:sz w:val="32"/>
+                <w:szCs w:val="40"/>
+              </w:rPr>
+              <w:t>–</w:t>
+            </w:r>
+            <w:r>
+              <w:rPr>
+                <w:rFonts w:ascii="BRH Malayalam Extra" w:hAnsi="BRH Malayalam Extra" w:cs="BRH Malayalam Extra"/>
+                <w:color w:val="EE0000"/>
+                <w:sz w:val="40"/>
+                <w:szCs w:val="40"/>
+              </w:rPr>
+              <w:t>Zõ¡s—I</w:t>
+            </w:r>
+            <w:r>
+              <w:rPr>
+                <w:rFonts w:ascii="BRH Devanagari Extra" w:hAnsi="BRH Devanagari Extra" w:cs="BRH Malayalam Extra"/>
+                <w:color w:val="EE0000"/>
+                <w:sz w:val="32"/>
+                <w:szCs w:val="40"/>
+              </w:rPr>
+              <w:t>Æ</w:t>
+            </w:r>
+            <w:r>
+              <w:rPr>
+                <w:rFonts w:ascii="BRH Malayalam Extra" w:hAnsi="BRH Malayalam Extra" w:cs="BRH Malayalam Extra"/>
+                <w:color w:val="EE0000"/>
+                <w:sz w:val="40"/>
+                <w:szCs w:val="40"/>
+              </w:rPr>
+              <w:t>j¡ZJ |</w:t>
+            </w:r>
+          </w:p>
+        </w:tc>
+      </w:tr>
+      <w:tr>
+        <w:trPr>
+          <w:trHeight w:val="2117"/>
+        </w:trPr>
+        <w:tc>
+          <w:tcPr>
+            <w:tcW w:w="3764" w:type="dxa"/>
+            <w:tcBorders>
+              <w:top w:val="single" w:sz="4" w:space="0" w:color="000000"/>
+              <w:left w:val="single" w:sz="4" w:space="0" w:color="000000"/>
+              <w:bottom w:val="single" w:sz="4" w:space="0" w:color="000000"/>
+              <w:right w:val="single" w:sz="4" w:space="0" w:color="000000"/>
+            </w:tcBorders>
+          </w:tcPr>
+          <w:p>
+            <w:pPr>
+              <w:widowControl w:val="0"/>
+              <w:tabs>
+                <w:tab w:val="left" w:pos="993"/>
+              </w:tabs>
+              <w:autoSpaceDE w:val="0"/>
+              <w:autoSpaceDN w:val="0"/>
+              <w:adjustRightInd w:val="0"/>
+              <w:spacing w:before="0" w:line="240" w:lineRule="auto"/>
+              <w:rPr>
+                <w:rFonts w:eastAsia="Times New Roman" w:cs="Arial"/>
+                <w:b/>
+                <w:sz w:val="32"/>
+                <w:szCs w:val="32"/>
+                <w:lang w:val="en-IN" w:eastAsia="en-IN" w:bidi="ml-IN"/>
+              </w:rPr>
+            </w:pPr>
+            <w:r>
+              <w:rPr>
+                <w:rFonts w:eastAsia="Times New Roman" w:cs="Arial"/>
+                <w:b/>
+                <w:sz w:val="32"/>
+                <w:szCs w:val="32"/>
+                <w:lang w:val="en-IN" w:eastAsia="en-IN" w:bidi="ml-IN"/>
+              </w:rPr>
+              <w:t>T.S.1.5.</w:t>
+            </w:r>
+            <w:r>
+              <w:rPr>
+                <w:rFonts w:eastAsia="Times New Roman" w:cs="Arial"/>
+                <w:b/>
+                <w:sz w:val="32"/>
+                <w:szCs w:val="32"/>
+                <w:lang w:val="en-IN" w:eastAsia="en-IN" w:bidi="ml-IN"/>
+              </w:rPr>
+              <w:t>11.2</w:t>
+            </w:r>
+            <w:r>
+              <w:rPr>
+                <w:rFonts w:eastAsia="Times New Roman" w:cs="Arial"/>
+                <w:b/>
+                <w:sz w:val="32"/>
+                <w:szCs w:val="32"/>
+                <w:lang w:val="en-IN" w:eastAsia="en-IN" w:bidi="ml-IN"/>
+              </w:rPr>
+              <w:t xml:space="preserve"> - Kramam</w:t>
+            </w:r>
+          </w:p>
+          <w:p>
+            <w:pPr>
+              <w:widowControl w:val="0"/>
+              <w:tabs>
+                <w:tab w:val="left" w:pos="993"/>
+              </w:tabs>
+              <w:autoSpaceDE w:val="0"/>
+              <w:autoSpaceDN w:val="0"/>
+              <w:adjustRightInd w:val="0"/>
+              <w:spacing w:before="0" w:line="240" w:lineRule="auto"/>
+              <w:rPr>
+                <w:rFonts w:eastAsia="Times New Roman" w:cs="Arial"/>
+                <w:b/>
+                <w:szCs w:val="24"/>
+                <w:lang w:val="en-IN" w:eastAsia="en-IN" w:bidi="ml-IN"/>
+              </w:rPr>
+            </w:pPr>
+            <w:r>
+              <w:rPr>
+                <w:rFonts w:eastAsia="Times New Roman" w:cs="Arial"/>
+                <w:b/>
+                <w:szCs w:val="24"/>
+                <w:lang w:val="en-IN" w:eastAsia="en-IN" w:bidi="ml-IN"/>
+              </w:rPr>
+              <w:t>Krama Vaakyam No. 46, 47</w:t>
+            </w:r>
+          </w:p>
+          <w:p>
+            <w:pPr>
+              <w:widowControl w:val="0"/>
+              <w:tabs>
+                <w:tab w:val="left" w:pos="993"/>
+              </w:tabs>
+              <w:autoSpaceDE w:val="0"/>
+              <w:autoSpaceDN w:val="0"/>
+              <w:adjustRightInd w:val="0"/>
+              <w:spacing w:before="0" w:line="240" w:lineRule="auto"/>
+              <w:rPr>
+                <w:rFonts w:eastAsia="Times New Roman" w:cs="Arial"/>
+                <w:b/>
+                <w:sz w:val="32"/>
+                <w:szCs w:val="32"/>
+                <w:lang w:val="it-IT" w:eastAsia="en-IN" w:bidi="ml-IN"/>
+              </w:rPr>
+            </w:pPr>
+            <w:r>
+              <w:rPr>
+                <w:rFonts w:eastAsia="Times New Roman" w:cs="Arial"/>
+                <w:b/>
+                <w:sz w:val="32"/>
+                <w:szCs w:val="32"/>
+                <w:lang w:val="it-IT" w:eastAsia="en-IN" w:bidi="ml-IN"/>
+              </w:rPr>
+              <w:t xml:space="preserve">Panchaati No. </w:t>
+            </w:r>
+            <w:r>
+              <w:rPr>
+                <w:rFonts w:eastAsia="Times New Roman" w:cs="Arial"/>
+                <w:b/>
+                <w:sz w:val="32"/>
+                <w:szCs w:val="32"/>
+                <w:lang w:val="it-IT" w:eastAsia="en-IN" w:bidi="ml-IN"/>
+              </w:rPr>
+              <w:t>48</w:t>
+            </w:r>
+          </w:p>
+        </w:tc>
+        <w:tc>
+          <w:tcPr>
+            <w:tcW w:w="5102" w:type="dxa"/>
+            <w:tcBorders>
+              <w:top w:val="single" w:sz="4" w:space="0" w:color="000000"/>
+              <w:left w:val="single" w:sz="4" w:space="0" w:color="000000"/>
+              <w:bottom w:val="single" w:sz="4" w:space="0" w:color="000000"/>
+              <w:right w:val="single" w:sz="4" w:space="0" w:color="000000"/>
+            </w:tcBorders>
+          </w:tcPr>
+          <w:p>
+            <w:pPr>
+              <w:widowControl w:val="0"/>
+              <w:autoSpaceDE w:val="0"/>
+              <w:autoSpaceDN w:val="0"/>
+              <w:adjustRightInd w:val="0"/>
+              <w:spacing w:before="0" w:line="240" w:lineRule="auto"/>
+              <w:rPr>
+                <w:rFonts w:ascii="BRH Malayalam Extra" w:hAnsi="BRH Malayalam Extra" w:cs="BRH Malayalam Extra"/>
+                <w:sz w:val="40"/>
+                <w:szCs w:val="40"/>
+              </w:rPr>
+            </w:pPr>
+            <w:r>
+              <w:rPr>
+                <w:rFonts w:ascii="BRH Malayalam Extra" w:hAnsi="BRH Malayalam Extra" w:cs="BRH Malayalam Extra"/>
+                <w:sz w:val="40"/>
+                <w:szCs w:val="40"/>
+              </w:rPr>
+              <w:t>i</w:t>
+            </w:r>
+            <w:r>
+              <w:rPr>
+                <w:rFonts w:ascii="BRH Malayalam Extra" w:hAnsi="BRH Malayalam Extra" w:cs="BRH Malayalam Extra"/>
+                <w:b/>
+                <w:sz w:val="32"/>
+                <w:szCs w:val="40"/>
+              </w:rPr>
+              <w:t>–</w:t>
+            </w:r>
+            <w:r>
+              <w:rPr>
+                <w:rFonts w:ascii="BRH Malayalam Extra" w:hAnsi="BRH Malayalam Extra" w:cs="BRH Malayalam Extra"/>
+                <w:sz w:val="40"/>
+                <w:szCs w:val="40"/>
+              </w:rPr>
+              <w:t>Np—a§s¡ cx</w:t>
+            </w:r>
+            <w:r>
+              <w:rPr>
+                <w:rFonts w:ascii="BRH Malayalam Extra" w:hAnsi="BRH Malayalam Extra" w:cs="BRH Malayalam Extra"/>
+                <w:sz w:val="40"/>
+                <w:szCs w:val="40"/>
+                <w:highlight w:val="yellow"/>
+              </w:rPr>
+              <w:t>k</w:t>
+            </w:r>
+            <w:r>
+              <w:rPr>
+                <w:rFonts w:ascii="BRH Malayalam Extra" w:hAnsi="BRH Malayalam Extra" w:cs="BRH Malayalam Extra"/>
+                <w:b/>
+                <w:sz w:val="32"/>
+                <w:szCs w:val="40"/>
+              </w:rPr>
+              <w:t>–</w:t>
+            </w:r>
+            <w:r>
+              <w:rPr>
+                <w:rFonts w:ascii="BRH Malayalam Extra" w:hAnsi="BRH Malayalam Extra" w:cs="BRH Malayalam Extra"/>
+                <w:sz w:val="40"/>
+                <w:szCs w:val="40"/>
+              </w:rPr>
+              <w:t xml:space="preserve">j | </w:t>
+            </w:r>
+          </w:p>
+          <w:p>
+            <w:pPr>
+              <w:widowControl w:val="0"/>
+              <w:autoSpaceDE w:val="0"/>
+              <w:autoSpaceDN w:val="0"/>
+              <w:adjustRightInd w:val="0"/>
+              <w:spacing w:before="0" w:line="240" w:lineRule="auto"/>
+              <w:rPr>
+                <w:rFonts w:ascii="BRH Malayalam Extra" w:hAnsi="BRH Malayalam Extra" w:cs="BRH Malayalam Extra"/>
+                <w:sz w:val="40"/>
+                <w:szCs w:val="40"/>
+              </w:rPr>
+            </w:pPr>
+            <w:r>
+              <w:rPr>
+                <w:rFonts w:ascii="BRH Malayalam Extra" w:hAnsi="BRH Malayalam Extra" w:cs="BRH Malayalam Extra"/>
+                <w:sz w:val="40"/>
+                <w:szCs w:val="40"/>
+              </w:rPr>
+              <w:t>i</w:t>
+            </w:r>
+            <w:r>
+              <w:rPr>
+                <w:rFonts w:ascii="BRH Malayalam Extra" w:hAnsi="BRH Malayalam Extra" w:cs="BRH Malayalam Extra"/>
+                <w:b/>
+                <w:sz w:val="32"/>
+                <w:szCs w:val="40"/>
+              </w:rPr>
+              <w:t>–</w:t>
+            </w:r>
+            <w:r>
+              <w:rPr>
+                <w:rFonts w:ascii="BRH Malayalam Extra" w:hAnsi="BRH Malayalam Extra" w:cs="BRH Malayalam Extra"/>
+                <w:sz w:val="40"/>
+                <w:szCs w:val="40"/>
+              </w:rPr>
+              <w:t>Np</w:t>
+            </w:r>
+            <w:r>
+              <w:rPr>
+                <w:rFonts w:ascii="BRH Malayalam Extra" w:hAnsi="BRH Malayalam Extra" w:cs="BRH Malayalam Extra"/>
+                <w:b/>
+                <w:sz w:val="32"/>
+                <w:szCs w:val="40"/>
+              </w:rPr>
+              <w:t>–</w:t>
+            </w:r>
+            <w:r>
+              <w:rPr>
+                <w:rFonts w:ascii="BRH Malayalam Extra" w:hAnsi="BRH Malayalam Extra" w:cs="BRH Malayalam Extra"/>
+                <w:sz w:val="40"/>
+                <w:szCs w:val="40"/>
+              </w:rPr>
+              <w:t xml:space="preserve">a§sûyZy— </w:t>
+            </w:r>
+          </w:p>
+          <w:p>
+            <w:pPr>
+              <w:widowControl w:val="0"/>
+              <w:autoSpaceDE w:val="0"/>
+              <w:autoSpaceDN w:val="0"/>
+              <w:adjustRightInd w:val="0"/>
+              <w:spacing w:before="0" w:line="240" w:lineRule="auto"/>
+              <w:ind w:right="-165"/>
+              <w:rPr>
+                <w:rFonts w:ascii="BRH Malayalam Extra" w:hAnsi="BRH Malayalam Extra" w:cs="BRH Malayalam Extra"/>
+                <w:sz w:val="40"/>
+                <w:szCs w:val="40"/>
+              </w:rPr>
+            </w:pPr>
+            <w:r>
+              <w:rPr>
+                <w:rFonts w:ascii="BRH Malayalam Extra" w:hAnsi="BRH Malayalam Extra" w:cs="BRH Malayalam Extra"/>
+                <w:sz w:val="40"/>
+                <w:szCs w:val="40"/>
+              </w:rPr>
+              <w:t>i</w:t>
+            </w:r>
+            <w:r>
+              <w:rPr>
+                <w:rFonts w:ascii="BRH Malayalam Extra" w:hAnsi="BRH Malayalam Extra" w:cs="BRH Malayalam Extra"/>
+                <w:b/>
+                <w:sz w:val="32"/>
+                <w:szCs w:val="40"/>
+              </w:rPr>
+              <w:t>–</w:t>
+            </w:r>
+            <w:r>
+              <w:rPr>
+                <w:rFonts w:ascii="BRH Malayalam Extra" w:hAnsi="BRH Malayalam Extra" w:cs="BRH Malayalam Extra"/>
+                <w:sz w:val="40"/>
+                <w:szCs w:val="40"/>
+              </w:rPr>
+              <w:t xml:space="preserve">Np—Z§ - </w:t>
+            </w:r>
+            <w:r>
+              <w:rPr>
+                <w:rFonts w:ascii="BRH Malayalam Extra" w:hAnsi="BRH Malayalam Extra" w:cs="BRH Malayalam Extra"/>
+                <w:sz w:val="40"/>
+                <w:szCs w:val="40"/>
+                <w:highlight w:val="yellow"/>
+              </w:rPr>
+              <w:t>s¡</w:t>
+            </w:r>
+            <w:r>
+              <w:rPr>
+                <w:rFonts w:ascii="BRH Malayalam Extra" w:hAnsi="BRH Malayalam Extra" w:cs="BRH Malayalam Extra"/>
+                <w:sz w:val="40"/>
+                <w:szCs w:val="40"/>
+              </w:rPr>
+              <w:t xml:space="preserve"> |</w:t>
+            </w:r>
+          </w:p>
+        </w:tc>
+        <w:tc>
+          <w:tcPr>
+            <w:tcW w:w="5103" w:type="dxa"/>
+            <w:tcBorders>
+              <w:top w:val="single" w:sz="4" w:space="0" w:color="000000"/>
+              <w:left w:val="single" w:sz="4" w:space="0" w:color="000000"/>
+              <w:bottom w:val="single" w:sz="4" w:space="0" w:color="000000"/>
+              <w:right w:val="single" w:sz="4" w:space="0" w:color="000000"/>
+            </w:tcBorders>
+          </w:tcPr>
+          <w:p>
+            <w:pPr>
+              <w:widowControl w:val="0"/>
+              <w:autoSpaceDE w:val="0"/>
+              <w:autoSpaceDN w:val="0"/>
+              <w:adjustRightInd w:val="0"/>
+              <w:spacing w:before="0" w:line="240" w:lineRule="auto"/>
+              <w:rPr>
+                <w:rFonts w:ascii="BRH Malayalam Extra" w:hAnsi="BRH Malayalam Extra" w:cs="BRH Malayalam Extra"/>
+                <w:sz w:val="40"/>
+                <w:szCs w:val="40"/>
+              </w:rPr>
+            </w:pPr>
+            <w:r>
+              <w:rPr>
+                <w:rFonts w:ascii="BRH Malayalam Extra" w:hAnsi="BRH Malayalam Extra" w:cs="BRH Malayalam Extra"/>
+                <w:sz w:val="40"/>
+                <w:szCs w:val="40"/>
+              </w:rPr>
+              <w:t>i</w:t>
+            </w:r>
+            <w:r>
+              <w:rPr>
+                <w:rFonts w:ascii="BRH Malayalam Extra" w:hAnsi="BRH Malayalam Extra" w:cs="BRH Malayalam Extra"/>
+                <w:b/>
+                <w:sz w:val="32"/>
+                <w:szCs w:val="40"/>
+              </w:rPr>
+              <w:t>–</w:t>
+            </w:r>
+            <w:r>
+              <w:rPr>
+                <w:rFonts w:ascii="BRH Malayalam Extra" w:hAnsi="BRH Malayalam Extra" w:cs="BRH Malayalam Extra"/>
+                <w:sz w:val="40"/>
+                <w:szCs w:val="40"/>
+              </w:rPr>
+              <w:t>Np—a§s¡ cx</w:t>
+            </w:r>
+            <w:r>
+              <w:rPr>
+                <w:rFonts w:ascii="BRH Malayalam Extra" w:hAnsi="BRH Malayalam Extra" w:cs="BRH Malayalam Extra"/>
+                <w:sz w:val="40"/>
+                <w:szCs w:val="40"/>
+                <w:highlight w:val="green"/>
+              </w:rPr>
+              <w:t>k</w:t>
+            </w:r>
+            <w:r>
+              <w:rPr>
+                <w:rFonts w:ascii="BRH Malayalam Extra" w:hAnsi="BRH Malayalam Extra" w:cs="BRH Malayalam Extra"/>
+                <w:sz w:val="40"/>
+                <w:szCs w:val="40"/>
+              </w:rPr>
+              <w:t xml:space="preserve">j | </w:t>
+            </w:r>
+          </w:p>
+          <w:p>
+            <w:pPr>
+              <w:widowControl w:val="0"/>
+              <w:autoSpaceDE w:val="0"/>
+              <w:autoSpaceDN w:val="0"/>
+              <w:adjustRightInd w:val="0"/>
+              <w:spacing w:before="0" w:line="240" w:lineRule="auto"/>
               <w:rPr>
                 <w:rFonts w:ascii="BRH Malayalam Extra" w:hAnsi="BRH Malayalam Extra" w:cs="BRH Malayalam Extra"/>
                 <w:sz w:val="40"/>
@@ -2014,7 +3724,6 @@
           <w:u w:val="single"/>
           <w:lang w:val="it-IT"/>
         </w:rPr>
-        <w:lastRenderedPageBreak/>
         <w:t>==========</w:t>
       </w:r>
     </w:p>
@@ -2199,6 +3908,7 @@
                 <w:sz w:val="32"/>
                 <w:szCs w:val="32"/>
               </w:rPr>
+              <w:lastRenderedPageBreak/>
               <w:t>Section, Paragraph</w:t>
             </w:r>
           </w:p>
@@ -3937,7 +5647,6 @@
                 <w:szCs w:val="32"/>
                 <w:lang w:val="en-IN" w:eastAsia="en-IN" w:bidi="ml-IN"/>
               </w:rPr>
-              <w:lastRenderedPageBreak/>
               <w:t>T.S.1.5.</w:t>
             </w:r>
             <w:r>
@@ -4590,6 +6299,7 @@
           <w:szCs w:val="32"/>
           <w:u w:val="single"/>
         </w:rPr>
+        <w:lastRenderedPageBreak/>
         <w:t>==========</w:t>
       </w:r>
     </w:p>
@@ -6148,7 +7858,6 @@
                 <w:szCs w:val="40"/>
                 <w:lang w:val="it-IT"/>
               </w:rPr>
-              <w:lastRenderedPageBreak/>
               <w:t>s¡ - i</w:t>
             </w:r>
             <w:r>
@@ -6222,7 +7931,6 @@
                 <w:szCs w:val="40"/>
                 <w:lang w:val="it-IT"/>
               </w:rPr>
-              <w:lastRenderedPageBreak/>
               <w:t>s¡</w:t>
             </w:r>
             <w:r>
@@ -6435,7 +8143,6 @@
                 <w:szCs w:val="40"/>
                 <w:lang w:val="it-IT"/>
               </w:rPr>
-              <w:lastRenderedPageBreak/>
               <w:t>s¡ - i</w:t>
             </w:r>
             <w:r>
@@ -6519,7 +8226,6 @@
                 <w:szCs w:val="32"/>
                 <w:lang w:val="en-IN" w:eastAsia="en-IN" w:bidi="ml-IN"/>
               </w:rPr>
-              <w:lastRenderedPageBreak/>
               <w:t>T.S.1.5.</w:t>
             </w:r>
             <w:r>
@@ -7981,7 +9687,6 @@
                 <w:szCs w:val="32"/>
                 <w:lang w:val="en-IN" w:eastAsia="en-IN" w:bidi="ml-IN"/>
               </w:rPr>
-              <w:lastRenderedPageBreak/>
               <w:t>T.S.1.5.4.2 - Kramam</w:t>
             </w:r>
           </w:p>
@@ -9059,6 +10764,7 @@
                 <w:szCs w:val="32"/>
                 <w:lang w:val="en-IN" w:eastAsia="en-IN" w:bidi="ml-IN"/>
               </w:rPr>
+              <w:lastRenderedPageBreak/>
               <w:t>T.S.1.5.9.4 - Kramam</w:t>
             </w:r>
           </w:p>
@@ -10368,16 +12074,7 @@
           <w:bCs/>
           <w:sz w:val="32"/>
         </w:rPr>
-        <w:t xml:space="preserve">replaced </w:t>
-      </w:r>
-      <w:proofErr w:type="gramStart"/>
-      <w:r>
-        <w:rPr>
-          <w:b/>
-          <w:bCs/>
-          <w:sz w:val="32"/>
-        </w:rPr>
-        <w:t>with</w:t>
+        <w:t>replaced with</w:t>
       </w:r>
       <w:r>
         <w:rPr>
@@ -10397,29 +12094,7 @@
           <w:szCs w:val="40"/>
           <w:lang w:val="en-IN" w:eastAsia="en-IN"/>
         </w:rPr>
-        <w:t>"</w:t>
-      </w:r>
-      <w:proofErr w:type="gramEnd"/>
-      <w:r>
-        <w:rPr>
-          <w:rFonts w:ascii="BRH Malayalam" w:hAnsi="BRH Malayalam" w:cs="BRH Malayalam"/>
-          <w:color w:val="000000"/>
-          <w:sz w:val="40"/>
-          <w:szCs w:val="40"/>
-          <w:lang w:val="en-IN" w:eastAsia="en-IN"/>
-        </w:rPr>
-        <w:t>q§T</w:t>
-      </w:r>
-      <w:proofErr w:type="gramStart"/>
-      <w:r>
-        <w:rPr>
-          <w:rFonts w:ascii="BRH Malayalam" w:hAnsi="BRH Malayalam" w:cs="BRH Malayalam"/>
-          <w:color w:val="000000"/>
-          <w:sz w:val="40"/>
-          <w:szCs w:val="40"/>
-          <w:lang w:val="en-IN" w:eastAsia="en-IN"/>
-        </w:rPr>
-        <w:t xml:space="preserve">"  </w:t>
+        <w:t xml:space="preserve">"q§T"  </w:t>
       </w:r>
       <w:r>
         <w:rPr>
@@ -10427,16 +12102,7 @@
           <w:bCs/>
           <w:sz w:val="32"/>
         </w:rPr>
-        <w:t>wherever</w:t>
-      </w:r>
-      <w:proofErr w:type="gramEnd"/>
-      <w:r>
-        <w:rPr>
-          <w:b/>
-          <w:bCs/>
-          <w:sz w:val="32"/>
-        </w:rPr>
-        <w:t xml:space="preserve"> applicable</w:t>
+        <w:t>wherever applicable</w:t>
       </w:r>
     </w:p>
     <w:p>
@@ -10458,7 +12124,6 @@
           <w:szCs w:val="32"/>
           <w:u w:val="single"/>
         </w:rPr>
-        <w:lastRenderedPageBreak/>
         <w:t>==============================</w:t>
       </w:r>
     </w:p>
@@ -10779,6 +12444,7 @@
                 <w:szCs w:val="32"/>
                 <w:lang w:val="en-IN" w:eastAsia="en-IN" w:bidi="ml-IN"/>
               </w:rPr>
+              <w:lastRenderedPageBreak/>
               <w:t>T.S.1.5.1.1</w:t>
             </w:r>
             <w:r>
@@ -12223,7 +13889,6 @@
                 <w:szCs w:val="32"/>
                 <w:lang w:val="en-IN" w:eastAsia="en-IN" w:bidi="ml-IN"/>
               </w:rPr>
-              <w:lastRenderedPageBreak/>
               <w:t>T.S.1.5.4.1</w:t>
             </w:r>
             <w:r>
@@ -12939,6 +14604,7 @@
                 <w:szCs w:val="32"/>
                 <w:lang w:val="en-IN" w:eastAsia="en-IN" w:bidi="ml-IN"/>
               </w:rPr>
+              <w:lastRenderedPageBreak/>
               <w:t>T.S.1.5.4.2</w:t>
             </w:r>
             <w:r>
@@ -14392,7 +16058,6 @@
                 <w:szCs w:val="32"/>
                 <w:lang w:val="en-IN" w:eastAsia="en-IN" w:bidi="ml-IN"/>
               </w:rPr>
-              <w:lastRenderedPageBreak/>
               <w:t>T.S.1.5.8.1</w:t>
             </w:r>
             <w:r>
@@ -14884,6 +16549,7 @@
                 <w:sz w:val="32"/>
                 <w:szCs w:val="36"/>
               </w:rPr>
+              <w:lastRenderedPageBreak/>
               <w:t>1.</w:t>
             </w:r>
             <w:r>
@@ -15181,9 +16847,8 @@
                 <w:szCs w:val="28"/>
                 <w:lang w:bidi="ml-IN"/>
               </w:rPr>
-              <w:t>(</w:t>
-            </w:r>
-            <w:proofErr w:type="gramStart"/>
+              <w:t>(tri kramam</w:t>
+            </w:r>
             <w:r>
               <w:rPr>
                 <w:rFonts w:cs="Arial"/>
@@ -15192,9 +16857,8 @@
                 <w:szCs w:val="28"/>
                 <w:lang w:bidi="ml-IN"/>
               </w:rPr>
-              <w:t>tri</w:t>
-            </w:r>
-            <w:proofErr w:type="gramEnd"/>
+              <w:t xml:space="preserve"> indicat</w:t>
+            </w:r>
             <w:r>
               <w:rPr>
                 <w:rFonts w:cs="Arial"/>
@@ -15203,7 +16867,7 @@
                 <w:szCs w:val="28"/>
                 <w:lang w:bidi="ml-IN"/>
               </w:rPr>
-              <w:t xml:space="preserve"> kramam</w:t>
+              <w:t xml:space="preserve">ion not given/missed </w:t>
             </w:r>
             <w:r>
               <w:rPr>
@@ -15213,37 +16877,7 @@
                 <w:szCs w:val="28"/>
                 <w:lang w:bidi="ml-IN"/>
               </w:rPr>
-              <w:t xml:space="preserve"> indicat</w:t>
-            </w:r>
-            <w:r>
-              <w:rPr>
-                <w:rFonts w:cs="Arial"/>
-                <w:color w:val="000000"/>
-                <w:sz w:val="28"/>
-                <w:szCs w:val="28"/>
-                <w:lang w:bidi="ml-IN"/>
-              </w:rPr>
-              <w:t xml:space="preserve">ion not given/missed </w:t>
-            </w:r>
-            <w:r>
-              <w:rPr>
-                <w:rFonts w:cs="Arial"/>
-                <w:color w:val="000000"/>
-                <w:sz w:val="28"/>
-                <w:szCs w:val="28"/>
-                <w:lang w:bidi="ml-IN"/>
-              </w:rPr>
               <w:br/>
-            </w:r>
-            <w:proofErr w:type="gramStart"/>
-            <w:r>
-              <w:rPr>
-                <w:rFonts w:cs="Arial"/>
-                <w:color w:val="000000"/>
-                <w:sz w:val="28"/>
-                <w:szCs w:val="28"/>
-                <w:lang w:bidi="ml-IN"/>
-              </w:rPr>
               <w:t xml:space="preserve">add </w:t>
             </w:r>
             <w:r>
@@ -15264,18 +16898,7 @@
                 <w:szCs w:val="36"/>
                 <w:highlight w:val="green"/>
               </w:rPr>
-              <w:t>„</w:t>
-            </w:r>
-            <w:proofErr w:type="gramEnd"/>
-            <w:r>
-              <w:rPr>
-                <w:rFonts w:ascii="BRH Malayalam Extra" w:hAnsi="BRH Malayalam Extra" w:cs="BRH Malayalam Extra"/>
-                <w:color w:val="000000"/>
-                <w:sz w:val="36"/>
-                <w:szCs w:val="36"/>
-                <w:highlight w:val="green"/>
-              </w:rPr>
-              <w:t>„</w:t>
+              <w:t>„„</w:t>
             </w:r>
             <w:r>
               <w:rPr>
@@ -15749,7 +17372,6 @@
           <w:b/>
           <w:sz w:val="32"/>
         </w:rPr>
-        <w:lastRenderedPageBreak/>
         <w:t>=========================</w:t>
       </w:r>
     </w:p>

</xml_diff>